<commit_message>
Entrega Banner, Documentação e POO
</commit_message>
<xml_diff>
--- a/documentos/Documento - Projeto de Extensão - COM Empresa.docx
+++ b/documentos/Documento - Projeto de Extensão - COM Empresa.docx
@@ -143,7 +143,7 @@
             <w:r>
               <w:rPr>
                 <w:rFonts w:ascii="Arial" w:eastAsia="Arial" w:hAnsi="Arial" w:cs="Arial"/>
-                <w:color w:val="525252" w:themeColor="accent3" w:themeShade="80"/>
+                <w:color w:val="000000" w:themeColor="text1"/>
                 <w:sz w:val="20"/>
                 <w:szCs w:val="20"/>
               </w:rPr>
@@ -196,7 +196,6 @@
           <w:between w:val="nil"/>
         </w:pBdr>
         <w:spacing w:after="0" w:line="240" w:lineRule="auto"/>
-        <w:ind w:left="360" w:hanging="360"/>
         <w:rPr>
           <w:rFonts w:ascii="Arial" w:eastAsia="Arial" w:hAnsi="Arial" w:cs="Arial"/>
           <w:b/>
@@ -205,16 +204,6 @@
           <w:szCs w:val="20"/>
         </w:rPr>
       </w:pPr>
-      <w:r>
-        <w:rPr>
-          <w:rFonts w:ascii="Arial" w:eastAsia="Arial" w:hAnsi="Arial" w:cs="Arial"/>
-          <w:b/>
-          <w:color w:val="525252" w:themeColor="accent3" w:themeShade="80"/>
-          <w:sz w:val="16"/>
-          <w:szCs w:val="16"/>
-        </w:rPr>
-        <w:t>Identificar o nome completo e o RA dos participantes do projeto</w:t>
-      </w:r>
     </w:p>
     <w:tbl>
       <w:tblPr>
@@ -485,6 +474,15 @@
                 <w:szCs w:val="20"/>
               </w:rPr>
             </w:pPr>
+            <w:r>
+              <w:rPr>
+                <w:rFonts w:ascii="Arial" w:eastAsia="Arial" w:hAnsi="Arial" w:cs="Arial"/>
+                <w:bCs/>
+                <w:sz w:val="20"/>
+                <w:szCs w:val="20"/>
+              </w:rPr>
+              <w:t>25027455</w:t>
+            </w:r>
           </w:p>
         </w:tc>
       </w:tr>
@@ -864,45 +862,6 @@
         <w:t>Linha de atuação</w:t>
       </w:r>
     </w:p>
-    <w:p>
-      <w:pPr>
-        <w:spacing w:after="0" w:line="240" w:lineRule="auto"/>
-        <w:jc w:val="both"/>
-        <w:rPr>
-          <w:rFonts w:ascii="Arial" w:eastAsia="Arial" w:hAnsi="Arial" w:cs="Arial"/>
-          <w:b/>
-          <w:color w:val="525252" w:themeColor="accent3" w:themeShade="80"/>
-          <w:sz w:val="20"/>
-          <w:szCs w:val="20"/>
-        </w:rPr>
-      </w:pPr>
-      <w:r>
-        <w:rPr>
-          <w:rFonts w:ascii="Arial Unicode MS" w:eastAsia="Arial Unicode MS" w:hAnsi="Arial Unicode MS" w:cs="Arial Unicode MS"/>
-          <w:b/>
-          <w:color w:val="525252" w:themeColor="accent3" w:themeShade="80"/>
-          <w:sz w:val="16"/>
-          <w:szCs w:val="16"/>
-        </w:rPr>
-        <w:t>Identificar com ✓ uma ou mais linhas de atuação conforme</w:t>
-      </w:r>
-      <w:r>
-        <w:rPr>
-          <w:color w:val="525252" w:themeColor="accent3" w:themeShade="80"/>
-        </w:rPr>
-        <w:t xml:space="preserve"> </w:t>
-      </w:r>
-      <w:r>
-        <w:rPr>
-          <w:rFonts w:ascii="Arial" w:eastAsia="Arial" w:hAnsi="Arial" w:cs="Arial"/>
-          <w:b/>
-          <w:color w:val="525252" w:themeColor="accent3" w:themeShade="80"/>
-          <w:sz w:val="16"/>
-          <w:szCs w:val="16"/>
-        </w:rPr>
-        <w:t xml:space="preserve">projeto pedagógico de curso. </w:t>
-      </w:r>
-    </w:p>
     <w:tbl>
       <w:tblPr>
         <w:tblW w:w="9450" w:type="dxa"/>
@@ -1041,29 +1000,6 @@
           <w:szCs w:val="20"/>
         </w:rPr>
         <w:t>Tipo de projeto</w:t>
-      </w:r>
-    </w:p>
-    <w:p>
-      <w:pPr>
-        <w:spacing w:after="0" w:line="240" w:lineRule="auto"/>
-        <w:jc w:val="both"/>
-        <w:rPr>
-          <w:rFonts w:ascii="Arial" w:eastAsia="Arial" w:hAnsi="Arial" w:cs="Arial"/>
-          <w:b/>
-          <w:color w:val="525252" w:themeColor="accent3" w:themeShade="80"/>
-          <w:sz w:val="16"/>
-          <w:szCs w:val="16"/>
-        </w:rPr>
-      </w:pPr>
-      <w:r>
-        <w:rPr>
-          <w:rFonts w:ascii="Arial Unicode MS" w:eastAsia="Arial Unicode MS" w:hAnsi="Arial Unicode MS" w:cs="Arial Unicode MS"/>
-          <w:b/>
-          <w:color w:val="525252" w:themeColor="accent3" w:themeShade="80"/>
-          <w:sz w:val="16"/>
-          <w:szCs w:val="16"/>
-        </w:rPr>
-        <w:t xml:space="preserve">Identificar com ✓ o tipo de projeto. </w:t>
       </w:r>
     </w:p>
     <w:tbl>
@@ -1099,40 +1035,19 @@
               <w:spacing w:after="0" w:line="240" w:lineRule="auto"/>
               <w:rPr>
                 <w:rFonts w:ascii="Arial" w:eastAsia="Arial" w:hAnsi="Arial" w:cs="Arial"/>
-                <w:sz w:val="20"/>
-                <w:szCs w:val="20"/>
-              </w:rPr>
-            </w:pPr>
-            <w:r>
-              <w:rPr>
-                <w:rFonts w:ascii="Arial" w:eastAsia="Arial" w:hAnsi="Arial" w:cs="Arial"/>
-                <w:sz w:val="20"/>
-                <w:szCs w:val="20"/>
-              </w:rPr>
-              <w:t>Atividade de Extensão não implementado na prática (proposta de intervenção)</w:t>
-            </w:r>
-          </w:p>
-          <w:p>
-            <w:pPr>
-              <w:numPr>
-                <w:ilvl w:val="0"/>
-                <w:numId w:val="1"/>
-              </w:numPr>
-              <w:shd w:val="clear" w:color="auto" w:fill="FFFFFF"/>
-              <w:spacing w:after="0" w:line="240" w:lineRule="auto"/>
-              <w:rPr>
-                <w:rFonts w:ascii="Arial" w:eastAsia="Arial" w:hAnsi="Arial" w:cs="Arial"/>
-                <w:sz w:val="20"/>
-                <w:szCs w:val="20"/>
-              </w:rPr>
-            </w:pPr>
-            <w:r>
-              <w:rPr>
-                <w:rFonts w:ascii="Arial" w:eastAsia="Arial" w:hAnsi="Arial" w:cs="Arial"/>
-                <w:sz w:val="20"/>
-                <w:szCs w:val="20"/>
-              </w:rPr>
-              <w:t>Atividade de Extensão implementado na prática (intervenção executada)</w:t>
+                <w:color w:val="000000" w:themeColor="text1"/>
+                <w:sz w:val="20"/>
+                <w:szCs w:val="20"/>
+              </w:rPr>
+            </w:pPr>
+            <w:r>
+              <w:rPr>
+                <w:rFonts w:ascii="Arial" w:eastAsia="Arial" w:hAnsi="Arial" w:cs="Arial"/>
+                <w:color w:val="000000" w:themeColor="text1"/>
+                <w:sz w:val="20"/>
+                <w:szCs w:val="20"/>
+              </w:rPr>
+              <w:t xml:space="preserve">Atividade de Extensão implementado na prática </w:t>
             </w:r>
           </w:p>
         </w:tc>
@@ -1145,6 +1060,7 @@
         <w:rPr>
           <w:rFonts w:ascii="Arial" w:eastAsia="Arial" w:hAnsi="Arial" w:cs="Arial"/>
           <w:b/>
+          <w:color w:val="000000" w:themeColor="text1"/>
           <w:sz w:val="20"/>
           <w:szCs w:val="20"/>
         </w:rPr>
@@ -1153,6 +1069,7 @@
         <w:rPr>
           <w:rFonts w:ascii="Arial" w:eastAsia="Arial" w:hAnsi="Arial" w:cs="Arial"/>
           <w:b/>
+          <w:color w:val="000000" w:themeColor="text1"/>
           <w:sz w:val="20"/>
           <w:szCs w:val="20"/>
         </w:rPr>
@@ -1201,54 +1118,19 @@
               <w:rPr>
                 <w:rFonts w:ascii="Arial" w:eastAsia="Arial" w:hAnsi="Arial" w:cs="Arial"/>
                 <w:b/>
-                <w:sz w:val="20"/>
-                <w:szCs w:val="20"/>
-              </w:rPr>
-            </w:pPr>
-            <w:r>
-              <w:rPr>
-                <w:rFonts w:ascii="Arial" w:eastAsia="Arial" w:hAnsi="Arial" w:cs="Arial"/>
-                <w:color w:val="525252" w:themeColor="accent3" w:themeShade="80"/>
-                <w:sz w:val="20"/>
-                <w:szCs w:val="20"/>
-              </w:rPr>
-              <w:t xml:space="preserve">Estabelecido conforme </w:t>
-            </w:r>
-            <w:r>
-              <w:rPr>
-                <w:rFonts w:ascii="Arial" w:eastAsia="Arial" w:hAnsi="Arial" w:cs="Arial"/>
-                <w:color w:val="525252" w:themeColor="accent3" w:themeShade="80"/>
-                <w:sz w:val="20"/>
-                <w:szCs w:val="20"/>
-              </w:rPr>
-              <w:t>seleção da ODS e dos</w:t>
-            </w:r>
-            <w:r>
-              <w:rPr>
-                <w:rFonts w:ascii="Arial" w:eastAsia="Arial" w:hAnsi="Arial" w:cs="Arial"/>
-                <w:color w:val="525252" w:themeColor="accent3" w:themeShade="80"/>
-                <w:sz w:val="20"/>
-                <w:szCs w:val="20"/>
-              </w:rPr>
-              <w:t xml:space="preserve"> conhecimento</w:t>
-            </w:r>
-            <w:r>
-              <w:rPr>
-                <w:rFonts w:ascii="Arial" w:eastAsia="Arial" w:hAnsi="Arial" w:cs="Arial"/>
-                <w:color w:val="525252" w:themeColor="accent3" w:themeShade="80"/>
-                <w:sz w:val="20"/>
-                <w:szCs w:val="20"/>
-              </w:rPr>
-              <w:t>s a</w:t>
-            </w:r>
-            <w:r>
-              <w:rPr>
-                <w:rFonts w:ascii="Arial" w:eastAsia="Arial" w:hAnsi="Arial" w:cs="Arial"/>
-                <w:color w:val="525252" w:themeColor="accent3" w:themeShade="80"/>
-                <w:sz w:val="20"/>
-                <w:szCs w:val="20"/>
-              </w:rPr>
-              <w:t xml:space="preserve"> serem trabalhados e orientações do docente.</w:t>
+                <w:color w:val="000000" w:themeColor="text1"/>
+                <w:sz w:val="20"/>
+                <w:szCs w:val="20"/>
+              </w:rPr>
+            </w:pPr>
+            <w:r>
+              <w:rPr>
+                <w:rFonts w:ascii="Arial" w:eastAsia="Arial" w:hAnsi="Arial" w:cs="Arial"/>
+                <w:color w:val="000000" w:themeColor="text1"/>
+                <w:sz w:val="20"/>
+                <w:szCs w:val="20"/>
+              </w:rPr>
+              <w:t>Site responsivo para o Instituto Alma</w:t>
             </w:r>
           </w:p>
         </w:tc>
@@ -1261,6 +1143,7 @@
         <w:rPr>
           <w:rFonts w:ascii="Arial" w:eastAsia="Arial" w:hAnsi="Arial" w:cs="Arial"/>
           <w:b/>
+          <w:color w:val="000000" w:themeColor="text1"/>
           <w:sz w:val="20"/>
           <w:szCs w:val="20"/>
         </w:rPr>
@@ -1269,6 +1152,7 @@
         <w:rPr>
           <w:rFonts w:ascii="Arial" w:eastAsia="Arial" w:hAnsi="Arial" w:cs="Arial"/>
           <w:b/>
+          <w:color w:val="000000" w:themeColor="text1"/>
           <w:sz w:val="20"/>
           <w:szCs w:val="20"/>
         </w:rPr>
@@ -1303,15 +1187,15 @@
               <w:shd w:val="clear" w:color="auto" w:fill="FFFFFF"/>
               <w:rPr>
                 <w:rFonts w:ascii="Arial" w:eastAsia="Arial" w:hAnsi="Arial" w:cs="Arial"/>
-                <w:color w:val="525252" w:themeColor="accent3" w:themeShade="80"/>
-                <w:sz w:val="20"/>
-                <w:szCs w:val="20"/>
-              </w:rPr>
-            </w:pPr>
-            <w:r>
-              <w:rPr>
-                <w:rFonts w:ascii="Arial" w:eastAsia="Arial" w:hAnsi="Arial" w:cs="Arial"/>
-                <w:color w:val="525252" w:themeColor="accent3" w:themeShade="80"/>
+                <w:color w:val="000000" w:themeColor="text1"/>
+                <w:sz w:val="20"/>
+                <w:szCs w:val="20"/>
+              </w:rPr>
+            </w:pPr>
+            <w:r>
+              <w:rPr>
+                <w:rFonts w:ascii="Arial" w:eastAsia="Arial" w:hAnsi="Arial" w:cs="Arial"/>
+                <w:color w:val="000000" w:themeColor="text1"/>
                 <w:sz w:val="20"/>
                 <w:szCs w:val="20"/>
               </w:rPr>
@@ -1323,15 +1207,15 @@
               <w:shd w:val="clear" w:color="auto" w:fill="FFFFFF"/>
               <w:rPr>
                 <w:rFonts w:ascii="Arial" w:eastAsia="Arial" w:hAnsi="Arial" w:cs="Arial"/>
-                <w:color w:val="525252" w:themeColor="accent3" w:themeShade="80"/>
-                <w:sz w:val="20"/>
-                <w:szCs w:val="20"/>
-              </w:rPr>
-            </w:pPr>
-            <w:r>
-              <w:rPr>
-                <w:rFonts w:ascii="Arial" w:eastAsia="Arial" w:hAnsi="Arial" w:cs="Arial"/>
-                <w:color w:val="525252" w:themeColor="accent3" w:themeShade="80"/>
+                <w:color w:val="000000" w:themeColor="text1"/>
+                <w:sz w:val="20"/>
+                <w:szCs w:val="20"/>
+              </w:rPr>
+            </w:pPr>
+            <w:r>
+              <w:rPr>
+                <w:rFonts w:ascii="Arial" w:eastAsia="Arial" w:hAnsi="Arial" w:cs="Arial"/>
+                <w:color w:val="000000" w:themeColor="text1"/>
                 <w:sz w:val="20"/>
                 <w:szCs w:val="20"/>
               </w:rPr>
@@ -1341,7 +1225,7 @@
               <w:rPr>
                 <w:rFonts w:ascii="Arial" w:eastAsia="Arial" w:hAnsi="Arial" w:cs="Arial"/>
                 <w:b/>
-                <w:color w:val="525252" w:themeColor="accent3" w:themeShade="80"/>
+                <w:color w:val="000000" w:themeColor="text1"/>
                 <w:sz w:val="16"/>
                 <w:szCs w:val="16"/>
               </w:rPr>
@@ -1350,7 +1234,7 @@
             <w:r>
               <w:rPr>
                 <w:rFonts w:ascii="Arial" w:eastAsia="Arial" w:hAnsi="Arial" w:cs="Arial"/>
-                <w:color w:val="525252" w:themeColor="accent3" w:themeShade="80"/>
+                <w:color w:val="000000" w:themeColor="text1"/>
                 <w:sz w:val="20"/>
                 <w:szCs w:val="20"/>
               </w:rPr>
@@ -1363,14 +1247,15 @@
               <w:rPr>
                 <w:rFonts w:ascii="Arial" w:eastAsia="Arial" w:hAnsi="Arial" w:cs="Arial"/>
                 <w:b/>
-                <w:sz w:val="20"/>
-                <w:szCs w:val="20"/>
-              </w:rPr>
-            </w:pPr>
-            <w:r>
-              <w:rPr>
-                <w:rFonts w:ascii="Arial" w:eastAsia="Arial" w:hAnsi="Arial" w:cs="Arial"/>
-                <w:color w:val="525252" w:themeColor="accent3" w:themeShade="80"/>
+                <w:color w:val="000000" w:themeColor="text1"/>
+                <w:sz w:val="20"/>
+                <w:szCs w:val="20"/>
+              </w:rPr>
+            </w:pPr>
+            <w:r>
+              <w:rPr>
+                <w:rFonts w:ascii="Arial" w:eastAsia="Arial" w:hAnsi="Arial" w:cs="Arial"/>
+                <w:color w:val="000000" w:themeColor="text1"/>
                 <w:sz w:val="20"/>
                 <w:szCs w:val="20"/>
               </w:rPr>
@@ -1386,17 +1271,19 @@
         <w:rPr>
           <w:rFonts w:ascii="Arial" w:eastAsia="Arial" w:hAnsi="Arial" w:cs="Arial"/>
           <w:b/>
-          <w:sz w:val="20"/>
-          <w:szCs w:val="20"/>
-        </w:rPr>
-      </w:pPr>
-    </w:p>
-    <w:p>
-      <w:pPr>
-        <w:spacing w:after="0" w:line="240" w:lineRule="auto"/>
-        <w:rPr>
-          <w:rFonts w:ascii="Arial" w:eastAsia="Arial" w:hAnsi="Arial" w:cs="Arial"/>
-          <w:b/>
+          <w:color w:val="000000" w:themeColor="text1"/>
+          <w:sz w:val="20"/>
+          <w:szCs w:val="20"/>
+        </w:rPr>
+      </w:pPr>
+    </w:p>
+    <w:p>
+      <w:pPr>
+        <w:spacing w:after="0" w:line="240" w:lineRule="auto"/>
+        <w:rPr>
+          <w:rFonts w:ascii="Arial" w:eastAsia="Arial" w:hAnsi="Arial" w:cs="Arial"/>
+          <w:b/>
+          <w:color w:val="000000" w:themeColor="text1"/>
           <w:sz w:val="20"/>
           <w:szCs w:val="20"/>
         </w:rPr>
@@ -1405,6 +1292,7 @@
         <w:rPr>
           <w:rFonts w:ascii="Arial" w:eastAsia="Arial" w:hAnsi="Arial" w:cs="Arial"/>
           <w:b/>
+          <w:color w:val="000000" w:themeColor="text1"/>
           <w:sz w:val="20"/>
           <w:szCs w:val="20"/>
         </w:rPr>
@@ -1417,7 +1305,7 @@
         <w:rPr>
           <w:rFonts w:ascii="Arial" w:eastAsia="Arial" w:hAnsi="Arial" w:cs="Arial"/>
           <w:b/>
-          <w:color w:val="FF3333"/>
+          <w:color w:val="000000" w:themeColor="text1"/>
           <w:sz w:val="16"/>
           <w:szCs w:val="16"/>
         </w:rPr>
@@ -1426,6 +1314,7 @@
         <w:rPr>
           <w:rFonts w:ascii="Arial" w:eastAsia="Arial" w:hAnsi="Arial" w:cs="Arial"/>
           <w:b/>
+          <w:color w:val="000000" w:themeColor="text1"/>
           <w:sz w:val="20"/>
           <w:szCs w:val="20"/>
         </w:rPr>
@@ -1465,21 +1354,77 @@
               <w:jc w:val="both"/>
               <w:rPr>
                 <w:rFonts w:ascii="Arial" w:eastAsia="Arial" w:hAnsi="Arial" w:cs="Arial"/>
-                <w:color w:val="FF3333"/>
-                <w:sz w:val="20"/>
-                <w:szCs w:val="20"/>
-              </w:rPr>
-            </w:pPr>
-            <w:r>
-              <w:rPr>
-                <w:rFonts w:ascii="Arial" w:eastAsia="Arial" w:hAnsi="Arial" w:cs="Arial"/>
-                <w:color w:val="525252" w:themeColor="accent3" w:themeShade="80"/>
+                <w:color w:val="000000" w:themeColor="text1"/>
+                <w:sz w:val="20"/>
+                <w:szCs w:val="20"/>
+              </w:rPr>
+            </w:pPr>
+            <w:r>
+              <w:rPr>
+                <w:rFonts w:ascii="Arial" w:eastAsia="Arial" w:hAnsi="Arial" w:cs="Arial"/>
+                <w:color w:val="000000" w:themeColor="text1"/>
+                <w:sz w:val="20"/>
+                <w:szCs w:val="20"/>
+              </w:rPr>
+              <w:t xml:space="preserve">A intervenção será realizada no ambiente digital, por meio do desenvolvimento de um website responsivo, acessível em diferentes dispositivos, como computadores, tablets e smartphones. Embora a implementação prática não seja obrigatória neste momento, o site tem potencial para fortalecer a </w:t>
+            </w:r>
+            <w:r>
+              <w:rPr>
+                <w:rFonts w:ascii="Arial" w:eastAsia="Arial" w:hAnsi="Arial" w:cs="Arial"/>
+                <w:color w:val="000000" w:themeColor="text1"/>
                 <w:sz w:val="20"/>
                 <w:szCs w:val="20"/>
               </w:rPr>
               <w:lastRenderedPageBreak/>
-              <w:t xml:space="preserve">Inserir os dados neste espaço. Orientações: conhecer na prática a realidade do campo de atuação. Definir e descrever o local em que a intervenção prevista na atividade de extensão pode ser implementada, lembrando que não há obrigatoriedade de esta ação ser efetivamente colocada em prática neste momento. É importante considerar intervenções tecnicamente exequíveis, sustentáveis e economicamente viáveis. </w:t>
-            </w:r>
+              <w:t>comunicação e a transparência do Instituto Alma, facilitando a divulgação de campanhas, o engajamento de voluntários e doadores, e ampliando a presença online da instituição.</w:t>
+            </w:r>
+          </w:p>
+          <w:p>
+            <w:pPr>
+              <w:pBdr>
+                <w:top w:val="nil"/>
+                <w:left w:val="nil"/>
+                <w:bottom w:val="nil"/>
+                <w:right w:val="nil"/>
+                <w:between w:val="nil"/>
+              </w:pBdr>
+              <w:spacing w:after="0" w:line="240" w:lineRule="auto"/>
+              <w:jc w:val="both"/>
+              <w:rPr>
+                <w:rFonts w:ascii="Arial" w:eastAsia="Arial" w:hAnsi="Arial" w:cs="Arial"/>
+                <w:color w:val="000000" w:themeColor="text1"/>
+                <w:sz w:val="20"/>
+                <w:szCs w:val="20"/>
+              </w:rPr>
+            </w:pPr>
+            <w:r>
+              <w:rPr>
+                <w:rFonts w:ascii="Arial" w:eastAsia="Arial" w:hAnsi="Arial" w:cs="Arial"/>
+                <w:color w:val="000000" w:themeColor="text1"/>
+                <w:sz w:val="20"/>
+                <w:szCs w:val="20"/>
+              </w:rPr>
+              <w:t>Espera-se que a plataforma proporcione um acesso simplificado às informações, permitindo que usuários encontrem com facilidade detalhes sobre programas, serviços e ações do instituto. Além disso, o site poderá estimular a participação e o engajamento do público, oferecendo recursos de contato, inscrição em atividades e envio de feedback. A estrutura será planejada para garantir que o conteúdo seja acessível a diferentes perfis de usuários e utilizável em múltiplos dispositivos. Paralelamente, permitirá à equipe do instituto atualizar conteúdos de maneira prática e segura, garantindo que informações relevantes estejam sempre disponíveis. Por fim, a plataforma possibilitará a coleta de dados sobre acessos e interações, fornecendo informações importantes para apoiar decisões estratégicas e melhorias contínuas nos serviços e ações do Instituto Alma.</w:t>
+            </w:r>
+          </w:p>
+          <w:p>
+            <w:pPr>
+              <w:pBdr>
+                <w:top w:val="nil"/>
+                <w:left w:val="nil"/>
+                <w:bottom w:val="nil"/>
+                <w:right w:val="nil"/>
+                <w:between w:val="nil"/>
+              </w:pBdr>
+              <w:spacing w:after="0" w:line="240" w:lineRule="auto"/>
+              <w:jc w:val="both"/>
+              <w:rPr>
+                <w:rFonts w:ascii="Arial" w:eastAsia="Arial" w:hAnsi="Arial" w:cs="Arial"/>
+                <w:color w:val="000000" w:themeColor="text1"/>
+                <w:sz w:val="20"/>
+                <w:szCs w:val="20"/>
+              </w:rPr>
+            </w:pPr>
           </w:p>
         </w:tc>
       </w:tr>
@@ -1490,18 +1435,19 @@
         <w:rPr>
           <w:rFonts w:ascii="Arial" w:eastAsia="Arial" w:hAnsi="Arial" w:cs="Arial"/>
           <w:b/>
-          <w:sz w:val="20"/>
-          <w:szCs w:val="20"/>
-        </w:rPr>
-      </w:pPr>
-    </w:p>
-    <w:p>
-      <w:pPr>
-        <w:spacing w:after="0" w:line="240" w:lineRule="auto"/>
-        <w:rPr>
-          <w:rFonts w:ascii="Arial" w:eastAsia="Arial" w:hAnsi="Arial" w:cs="Arial"/>
-          <w:b/>
-          <w:color w:val="FF3333"/>
+          <w:color w:val="000000" w:themeColor="text1"/>
+          <w:sz w:val="20"/>
+          <w:szCs w:val="20"/>
+        </w:rPr>
+      </w:pPr>
+    </w:p>
+    <w:p>
+      <w:pPr>
+        <w:spacing w:after="0" w:line="240" w:lineRule="auto"/>
+        <w:rPr>
+          <w:rFonts w:ascii="Arial" w:eastAsia="Arial" w:hAnsi="Arial" w:cs="Arial"/>
+          <w:b/>
+          <w:color w:val="000000" w:themeColor="text1"/>
           <w:sz w:val="16"/>
           <w:szCs w:val="16"/>
         </w:rPr>
@@ -1510,6 +1456,7 @@
         <w:rPr>
           <w:rFonts w:ascii="Arial" w:eastAsia="Arial" w:hAnsi="Arial" w:cs="Arial"/>
           <w:b/>
+          <w:color w:val="000000" w:themeColor="text1"/>
           <w:sz w:val="20"/>
           <w:szCs w:val="20"/>
         </w:rPr>
@@ -1549,19 +1496,19 @@
               <w:jc w:val="both"/>
               <w:rPr>
                 <w:rFonts w:ascii="Arial" w:eastAsia="Arial" w:hAnsi="Arial" w:cs="Arial"/>
-                <w:color w:val="1F4E79"/>
-                <w:sz w:val="20"/>
-                <w:szCs w:val="20"/>
-              </w:rPr>
-            </w:pPr>
-            <w:r>
-              <w:rPr>
-                <w:rFonts w:ascii="Arial" w:eastAsia="Arial" w:hAnsi="Arial" w:cs="Arial"/>
-                <w:color w:val="525252" w:themeColor="accent3" w:themeShade="80"/>
-                <w:sz w:val="20"/>
-                <w:szCs w:val="20"/>
-              </w:rPr>
-              <w:t xml:space="preserve">Inserir os dados neste espaço. Orientações: buscar conhecer na prática a realidade do campo de atuação para a intervenção extensionista. Definir os sujeitos que poderão ser impactados pela intervenção. Caracterizar o público-alvo, características socioeconômicas e educacionais ou outros dados considerados relevantes. Nesta etapa poderá ser realizado um levantamento diagnóstico da comunidade, os dados podem ser obtidos na prática com base na metodologia proposta para o projeto de extensão (visitas, entrevistas, questionários, reuniões, roda de conversa, ou uso de outras ferramentas de levantamento). Adequar a proposta de acordo com as especificidades do curso. Os dados aqui inseridos também podem ser empregados na concepção do projeto propriamente dito. </w:t>
+                <w:color w:val="000000" w:themeColor="text1"/>
+                <w:sz w:val="20"/>
+                <w:szCs w:val="20"/>
+              </w:rPr>
+            </w:pPr>
+            <w:r>
+              <w:rPr>
+                <w:rFonts w:ascii="Arial" w:eastAsia="Arial" w:hAnsi="Arial" w:cs="Arial"/>
+                <w:color w:val="000000" w:themeColor="text1"/>
+                <w:sz w:val="20"/>
+                <w:szCs w:val="20"/>
+              </w:rPr>
+              <w:t>O projeto é direcionado a pessoas físicas e jurídicas interessadas em se engajar com o Instituto Alma, seja por meio de apoio financeiro, voluntariado ou parceria. Além disso, atende à comunidade em geral, que busca informações sobre as atividades, programas, resultados e impacto social da instituição, de maneira clara, acessível e transparente.</w:t>
             </w:r>
           </w:p>
         </w:tc>
@@ -1573,17 +1520,19 @@
         <w:rPr>
           <w:rFonts w:ascii="Arial" w:eastAsia="Arial" w:hAnsi="Arial" w:cs="Arial"/>
           <w:b/>
-          <w:sz w:val="20"/>
-          <w:szCs w:val="20"/>
-        </w:rPr>
-      </w:pPr>
-    </w:p>
-    <w:p>
-      <w:pPr>
-        <w:spacing w:after="0" w:line="240" w:lineRule="auto"/>
-        <w:rPr>
-          <w:rFonts w:ascii="Arial" w:eastAsia="Arial" w:hAnsi="Arial" w:cs="Arial"/>
-          <w:b/>
+          <w:color w:val="000000" w:themeColor="text1"/>
+          <w:sz w:val="20"/>
+          <w:szCs w:val="20"/>
+        </w:rPr>
+      </w:pPr>
+    </w:p>
+    <w:p>
+      <w:pPr>
+        <w:spacing w:after="0" w:line="240" w:lineRule="auto"/>
+        <w:rPr>
+          <w:rFonts w:ascii="Arial" w:eastAsia="Arial" w:hAnsi="Arial" w:cs="Arial"/>
+          <w:b/>
+          <w:color w:val="000000" w:themeColor="text1"/>
           <w:sz w:val="20"/>
           <w:szCs w:val="20"/>
         </w:rPr>
@@ -1592,6 +1541,7 @@
         <w:rPr>
           <w:rFonts w:ascii="Arial" w:eastAsia="Arial" w:hAnsi="Arial" w:cs="Arial"/>
           <w:b/>
+          <w:color w:val="000000" w:themeColor="text1"/>
           <w:sz w:val="20"/>
           <w:szCs w:val="20"/>
         </w:rPr>
@@ -1631,38 +1581,47 @@
               <w:jc w:val="both"/>
               <w:rPr>
                 <w:rFonts w:ascii="Arial" w:eastAsia="Arial" w:hAnsi="Arial" w:cs="Arial"/>
-                <w:color w:val="1F4E79"/>
-                <w:sz w:val="20"/>
-                <w:szCs w:val="20"/>
-              </w:rPr>
-            </w:pPr>
-            <w:r>
-              <w:rPr>
-                <w:rFonts w:ascii="Arial" w:eastAsia="Arial" w:hAnsi="Arial" w:cs="Arial"/>
-                <w:color w:val="525252" w:themeColor="accent3" w:themeShade="80"/>
-                <w:sz w:val="20"/>
-                <w:szCs w:val="20"/>
-              </w:rPr>
-              <w:t>Inserir os dados neste espaço. Orientações:</w:t>
-            </w:r>
-            <w:r>
-              <w:rPr>
-                <w:rFonts w:ascii="Arial" w:eastAsia="Arial" w:hAnsi="Arial" w:cs="Arial"/>
-                <w:b/>
-                <w:color w:val="525252" w:themeColor="accent3" w:themeShade="80"/>
-                <w:sz w:val="16"/>
-                <w:szCs w:val="16"/>
-              </w:rPr>
-              <w:t xml:space="preserve"> </w:t>
-            </w:r>
-            <w:r>
-              <w:rPr>
-                <w:rFonts w:ascii="Arial" w:eastAsia="Arial" w:hAnsi="Arial" w:cs="Arial"/>
-                <w:color w:val="525252" w:themeColor="accent3" w:themeShade="80"/>
-                <w:sz w:val="20"/>
-                <w:szCs w:val="20"/>
-              </w:rPr>
-              <w:t xml:space="preserve">observar a realidade em si, identificar os postos-chave, os problemas apontados e suas características para que o plano de intervenção possa contribuir na transformação da realidade observada. Selecionar o problema que será objeto da intervenção e apresentar argumentos relativos à sua relevância de estudo. Os dados aqui inseridos também podem ser empregados na concepção do projeto propriamente dito. </w:t>
+                <w:color w:val="000000" w:themeColor="text1"/>
+                <w:sz w:val="20"/>
+                <w:szCs w:val="20"/>
+              </w:rPr>
+            </w:pPr>
+            <w:r>
+              <w:rPr>
+                <w:rFonts w:ascii="Arial" w:eastAsia="Arial" w:hAnsi="Arial" w:cs="Arial"/>
+                <w:color w:val="000000" w:themeColor="text1"/>
+                <w:sz w:val="20"/>
+                <w:szCs w:val="20"/>
+              </w:rPr>
+              <w:t>Atualmente, as informações sobre o Instituto Alma encontram-se dispersas e, muitas vezes, de difícil acesso para potenciais doadores, voluntários e público interessado. Essa ausência de centralização e de adaptação a ambientes digitais limita o alcance das ações do instituto e compromete a eficácia da comunicação com seus diferentes públicos.</w:t>
+            </w:r>
+          </w:p>
+          <w:p>
+            <w:pPr>
+              <w:pBdr>
+                <w:top w:val="nil"/>
+                <w:left w:val="nil"/>
+                <w:bottom w:val="nil"/>
+                <w:right w:val="nil"/>
+                <w:between w:val="nil"/>
+              </w:pBdr>
+              <w:spacing w:after="0" w:line="240" w:lineRule="auto"/>
+              <w:jc w:val="both"/>
+              <w:rPr>
+                <w:rFonts w:ascii="Arial" w:eastAsia="Arial" w:hAnsi="Arial" w:cs="Arial"/>
+                <w:color w:val="000000" w:themeColor="text1"/>
+                <w:sz w:val="20"/>
+                <w:szCs w:val="20"/>
+              </w:rPr>
+            </w:pPr>
+            <w:r>
+              <w:rPr>
+                <w:rFonts w:ascii="Arial" w:eastAsia="Arial" w:hAnsi="Arial" w:cs="Arial"/>
+                <w:color w:val="000000" w:themeColor="text1"/>
+                <w:sz w:val="20"/>
+                <w:szCs w:val="20"/>
+              </w:rPr>
+              <w:t>Diante desse contexto, o objeto de estudo e intervenção deste projeto é o desenvolvimento de um website responsivo para o Instituto Alma. A plataforma permitirá organizar e divulgar de forma clara campanhas, atividades e relatórios de transparência, fortalecendo a comunicação institucional, ampliando o engajamento social e incentivando a participação de voluntários e apoiadores.</w:t>
             </w:r>
           </w:p>
         </w:tc>
@@ -1674,17 +1633,19 @@
         <w:rPr>
           <w:rFonts w:ascii="Arial" w:eastAsia="Arial" w:hAnsi="Arial" w:cs="Arial"/>
           <w:b/>
-          <w:sz w:val="20"/>
-          <w:szCs w:val="20"/>
-        </w:rPr>
-      </w:pPr>
-    </w:p>
-    <w:p>
-      <w:pPr>
-        <w:spacing w:after="0" w:line="240" w:lineRule="auto"/>
-        <w:rPr>
-          <w:rFonts w:ascii="Arial" w:eastAsia="Arial" w:hAnsi="Arial" w:cs="Arial"/>
-          <w:b/>
+          <w:color w:val="000000" w:themeColor="text1"/>
+          <w:sz w:val="20"/>
+          <w:szCs w:val="20"/>
+        </w:rPr>
+      </w:pPr>
+    </w:p>
+    <w:p>
+      <w:pPr>
+        <w:spacing w:after="0" w:line="240" w:lineRule="auto"/>
+        <w:rPr>
+          <w:rFonts w:ascii="Arial" w:eastAsia="Arial" w:hAnsi="Arial" w:cs="Arial"/>
+          <w:b/>
+          <w:color w:val="000000" w:themeColor="text1"/>
           <w:sz w:val="20"/>
           <w:szCs w:val="20"/>
         </w:rPr>
@@ -1693,6 +1654,7 @@
         <w:rPr>
           <w:rFonts w:ascii="Arial" w:eastAsia="Arial" w:hAnsi="Arial" w:cs="Arial"/>
           <w:b/>
+          <w:color w:val="000000" w:themeColor="text1"/>
           <w:sz w:val="20"/>
           <w:szCs w:val="20"/>
         </w:rPr>
@@ -1732,48 +1694,19 @@
               <w:jc w:val="both"/>
               <w:rPr>
                 <w:rFonts w:ascii="Arial" w:eastAsia="Arial" w:hAnsi="Arial" w:cs="Arial"/>
-                <w:color w:val="FF3333"/>
-                <w:sz w:val="20"/>
-                <w:szCs w:val="20"/>
-              </w:rPr>
-            </w:pPr>
-            <w:r>
-              <w:rPr>
-                <w:rFonts w:ascii="Arial" w:eastAsia="Arial" w:hAnsi="Arial" w:cs="Arial"/>
-                <w:color w:val="525252" w:themeColor="accent3" w:themeShade="80"/>
-                <w:sz w:val="20"/>
-                <w:szCs w:val="20"/>
-              </w:rPr>
-              <w:t>Inserir os dados neste espaço. Orientações:</w:t>
-            </w:r>
-            <w:r>
-              <w:rPr>
-                <w:rFonts w:ascii="Arial" w:eastAsia="Arial" w:hAnsi="Arial" w:cs="Arial"/>
-                <w:b/>
-                <w:color w:val="525252" w:themeColor="accent3" w:themeShade="80"/>
-                <w:sz w:val="16"/>
-                <w:szCs w:val="16"/>
-              </w:rPr>
-              <w:t xml:space="preserve"> </w:t>
-            </w:r>
-            <w:r>
-              <w:rPr>
-                <w:rFonts w:ascii="Arial" w:eastAsia="Arial" w:hAnsi="Arial" w:cs="Arial"/>
-                <w:color w:val="525252" w:themeColor="accent3" w:themeShade="80"/>
-                <w:sz w:val="20"/>
-                <w:szCs w:val="20"/>
-              </w:rPr>
-              <w:t>as hipóteses devem ser construídas após a teorização e estudo do problema observado. Relacionar hipóteses de intervenção para solução do problema de estudo e selecionar a mais adequada. É importante considerar intervenções tecnicamente exequíveis, sustentáveis e economicamente viáveis</w:t>
-            </w:r>
-            <w:r>
-              <w:rPr>
-                <w:rFonts w:ascii="Arial" w:eastAsia="Arial" w:hAnsi="Arial" w:cs="Arial"/>
-                <w:b/>
-                <w:color w:val="525252" w:themeColor="accent3" w:themeShade="80"/>
-                <w:sz w:val="16"/>
-                <w:szCs w:val="16"/>
-              </w:rPr>
-              <w:t>.</w:t>
+                <w:color w:val="000000" w:themeColor="text1"/>
+                <w:sz w:val="20"/>
+                <w:szCs w:val="20"/>
+              </w:rPr>
+            </w:pPr>
+            <w:r>
+              <w:rPr>
+                <w:rFonts w:ascii="Arial" w:eastAsia="Arial" w:hAnsi="Arial" w:cs="Arial"/>
+                <w:color w:val="000000" w:themeColor="text1"/>
+                <w:sz w:val="20"/>
+                <w:szCs w:val="20"/>
+              </w:rPr>
+              <w:t>Com base na análise do problema identificado, levantou-se a hipótese de que a criação de um website responsivo pode contribuir significativamente para melhorar a comunicação do Instituto Alma, ampliar o alcance de suas campanhas e reforçar a transparência de suas ações. Essa solução foi considerada adequada por oferecer uma forma prática e eficiente de centralizar informações, facilitar o engajamento de voluntários e doadores, e proporcionar um ambiente digital unificado que apoie a divulgação e o acompanhamento das iniciativas da instituição.</w:t>
             </w:r>
           </w:p>
         </w:tc>
@@ -1785,104 +1718,42 @@
         <w:rPr>
           <w:rFonts w:ascii="Arial" w:eastAsia="Arial" w:hAnsi="Arial" w:cs="Arial"/>
           <w:b/>
-          <w:sz w:val="20"/>
-          <w:szCs w:val="20"/>
-        </w:rPr>
-      </w:pPr>
-    </w:p>
-    <w:p>
-      <w:pPr>
-        <w:spacing w:after="0" w:line="240" w:lineRule="auto"/>
-        <w:rPr>
-          <w:rFonts w:ascii="Arial" w:eastAsia="Arial" w:hAnsi="Arial" w:cs="Arial"/>
-          <w:b/>
-          <w:sz w:val="20"/>
-          <w:szCs w:val="20"/>
-        </w:rPr>
-      </w:pPr>
-    </w:p>
-    <w:p>
-      <w:pPr>
-        <w:spacing w:after="0" w:line="240" w:lineRule="auto"/>
-        <w:rPr>
-          <w:rFonts w:ascii="Arial" w:eastAsia="Arial" w:hAnsi="Arial" w:cs="Arial"/>
-          <w:b/>
-          <w:sz w:val="20"/>
-          <w:szCs w:val="20"/>
-        </w:rPr>
-      </w:pPr>
-    </w:p>
-    <w:p>
-      <w:pPr>
-        <w:spacing w:after="0" w:line="240" w:lineRule="auto"/>
-        <w:rPr>
-          <w:rFonts w:ascii="Arial" w:eastAsia="Arial" w:hAnsi="Arial" w:cs="Arial"/>
-          <w:b/>
-          <w:sz w:val="20"/>
-          <w:szCs w:val="20"/>
-        </w:rPr>
-      </w:pPr>
-    </w:p>
-    <w:p>
-      <w:pPr>
-        <w:spacing w:after="0" w:line="240" w:lineRule="auto"/>
-        <w:rPr>
-          <w:rFonts w:ascii="Arial" w:eastAsia="Arial" w:hAnsi="Arial" w:cs="Arial"/>
-          <w:b/>
-          <w:sz w:val="20"/>
-          <w:szCs w:val="20"/>
-        </w:rPr>
-      </w:pPr>
-    </w:p>
-    <w:p>
-      <w:pPr>
-        <w:spacing w:after="0" w:line="240" w:lineRule="auto"/>
-        <w:rPr>
-          <w:rFonts w:ascii="Arial" w:eastAsia="Arial" w:hAnsi="Arial" w:cs="Arial"/>
-          <w:b/>
-          <w:sz w:val="20"/>
-          <w:szCs w:val="20"/>
-        </w:rPr>
-      </w:pPr>
-    </w:p>
-    <w:p>
-      <w:pPr>
-        <w:spacing w:after="0" w:line="240" w:lineRule="auto"/>
-        <w:rPr>
-          <w:rFonts w:ascii="Arial" w:eastAsia="Arial" w:hAnsi="Arial" w:cs="Arial"/>
-          <w:b/>
-          <w:sz w:val="20"/>
-          <w:szCs w:val="20"/>
-        </w:rPr>
-      </w:pPr>
-    </w:p>
-    <w:p>
-      <w:pPr>
-        <w:spacing w:after="0" w:line="240" w:lineRule="auto"/>
-        <w:rPr>
-          <w:rFonts w:ascii="Arial" w:eastAsia="Arial" w:hAnsi="Arial" w:cs="Arial"/>
-          <w:b/>
-          <w:sz w:val="20"/>
-          <w:szCs w:val="20"/>
-        </w:rPr>
-      </w:pPr>
-    </w:p>
-    <w:p>
-      <w:pPr>
-        <w:spacing w:after="0" w:line="240" w:lineRule="auto"/>
-        <w:rPr>
-          <w:rFonts w:ascii="Arial" w:eastAsia="Arial" w:hAnsi="Arial" w:cs="Arial"/>
-          <w:b/>
-          <w:sz w:val="20"/>
-          <w:szCs w:val="20"/>
-        </w:rPr>
-      </w:pPr>
-    </w:p>
-    <w:p>
-      <w:pPr>
-        <w:spacing w:after="0" w:line="240" w:lineRule="auto"/>
-        <w:rPr>
-          <w:rFonts w:ascii="Arial" w:eastAsia="Arial" w:hAnsi="Arial" w:cs="Arial"/>
+          <w:color w:val="000000" w:themeColor="text1"/>
+          <w:sz w:val="20"/>
+          <w:szCs w:val="20"/>
+        </w:rPr>
+      </w:pPr>
+    </w:p>
+    <w:p>
+      <w:pPr>
+        <w:spacing w:after="0" w:line="240" w:lineRule="auto"/>
+        <w:rPr>
+          <w:rFonts w:ascii="Arial" w:eastAsia="Arial" w:hAnsi="Arial" w:cs="Arial"/>
+          <w:b/>
+          <w:color w:val="000000" w:themeColor="text1"/>
+          <w:sz w:val="20"/>
+          <w:szCs w:val="20"/>
+        </w:rPr>
+      </w:pPr>
+    </w:p>
+    <w:p>
+      <w:pPr>
+        <w:spacing w:after="0" w:line="240" w:lineRule="auto"/>
+        <w:rPr>
+          <w:rFonts w:ascii="Arial" w:eastAsia="Arial" w:hAnsi="Arial" w:cs="Arial"/>
+          <w:b/>
+          <w:color w:val="000000" w:themeColor="text1"/>
+          <w:sz w:val="20"/>
+          <w:szCs w:val="20"/>
+        </w:rPr>
+      </w:pPr>
+    </w:p>
+    <w:p>
+      <w:pPr>
+        <w:spacing w:after="0" w:line="240" w:lineRule="auto"/>
+        <w:rPr>
+          <w:rFonts w:ascii="Arial" w:eastAsia="Arial" w:hAnsi="Arial" w:cs="Arial"/>
+          <w:color w:val="000000" w:themeColor="text1"/>
           <w:sz w:val="20"/>
           <w:szCs w:val="20"/>
         </w:rPr>
@@ -1891,6 +1762,7 @@
         <w:rPr>
           <w:rFonts w:ascii="Arial" w:eastAsia="Arial" w:hAnsi="Arial" w:cs="Arial"/>
           <w:b/>
+          <w:color w:val="000000" w:themeColor="text1"/>
           <w:sz w:val="20"/>
           <w:szCs w:val="20"/>
         </w:rPr>
@@ -1899,32 +1771,24 @@
     </w:p>
     <w:p>
       <w:pPr>
-        <w:pBdr>
-          <w:top w:val="nil"/>
-          <w:left w:val="nil"/>
-          <w:bottom w:val="nil"/>
-          <w:right w:val="nil"/>
-          <w:between w:val="nil"/>
-        </w:pBdr>
-        <w:spacing w:after="0" w:line="240" w:lineRule="auto"/>
-        <w:jc w:val="both"/>
-        <w:rPr>
-          <w:rFonts w:ascii="Arial" w:eastAsia="Arial" w:hAnsi="Arial" w:cs="Arial"/>
-          <w:b/>
-          <w:color w:val="525252" w:themeColor="accent3" w:themeShade="80"/>
-          <w:sz w:val="16"/>
-          <w:szCs w:val="16"/>
+        <w:spacing w:after="0" w:line="240" w:lineRule="auto"/>
+        <w:rPr>
+          <w:rFonts w:ascii="Arial" w:eastAsia="Arial" w:hAnsi="Arial" w:cs="Arial"/>
+          <w:bCs/>
+          <w:color w:val="000000" w:themeColor="text1"/>
+          <w:sz w:val="20"/>
+          <w:szCs w:val="20"/>
         </w:rPr>
       </w:pPr>
       <w:r>
         <w:rPr>
           <w:rFonts w:ascii="Arial" w:eastAsia="Arial" w:hAnsi="Arial" w:cs="Arial"/>
-          <w:b/>
-          <w:color w:val="525252" w:themeColor="accent3" w:themeShade="80"/>
-          <w:sz w:val="16"/>
-          <w:szCs w:val="16"/>
-        </w:rPr>
-        <w:t xml:space="preserve">É importante destacar que um projeto de extensão não precisa ser necessariamente igual a um projeto de pesquisa. Mesmo que haja necessidade de pesquisa prévia para a fundamentação teórica, construção da introdução e para um melhor entendimento sobre a realidade a ser trabalhada, é preciso que um projeto de extensão contemple práticas que promovam mudanças e/ou melhorias identificadas como necessárias. O projeto final deverá ser simples, objetivo, claro e ter de 3 a 5 páginas, dentro do modelo aqui proposto. </w:t>
+          <w:bCs/>
+          <w:color w:val="000000" w:themeColor="text1"/>
+          <w:sz w:val="20"/>
+          <w:szCs w:val="20"/>
+        </w:rPr>
+        <w:t>O projeto de extensão tem como objetivo a criação de um website responsivo para o Instituto Alma, uma organização sem fins lucrativos dedicada a ações sociais e à promoção da transparência. A iniciativa busca superar as dificuldades de comunicação e divulgação enfrentadas pela instituição, centralizando em uma única plataforma informações sobre campanhas, projetos e relatórios institucionais.</w:t>
       </w:r>
     </w:p>
     <w:p>
@@ -1932,16 +1796,8 @@
         <w:spacing w:after="0" w:line="240" w:lineRule="auto"/>
         <w:rPr>
           <w:rFonts w:ascii="Arial" w:eastAsia="Arial" w:hAnsi="Arial" w:cs="Arial"/>
-          <w:sz w:val="20"/>
-          <w:szCs w:val="20"/>
-        </w:rPr>
-      </w:pPr>
-    </w:p>
-    <w:p>
-      <w:pPr>
-        <w:spacing w:after="0" w:line="240" w:lineRule="auto"/>
-        <w:rPr>
-          <w:rFonts w:ascii="Arial" w:eastAsia="Arial" w:hAnsi="Arial" w:cs="Arial"/>
+          <w:bCs/>
+          <w:color w:val="000000" w:themeColor="text1"/>
           <w:sz w:val="20"/>
           <w:szCs w:val="20"/>
         </w:rPr>
@@ -1949,7 +1805,40 @@
       <w:r>
         <w:rPr>
           <w:rFonts w:ascii="Arial" w:eastAsia="Arial" w:hAnsi="Arial" w:cs="Arial"/>
-          <w:b/>
+          <w:bCs/>
+          <w:color w:val="000000" w:themeColor="text1"/>
+          <w:sz w:val="20"/>
+          <w:szCs w:val="20"/>
+        </w:rPr>
+        <w:t>A proposta visa não apenas ampliar a visibilidade das ações do instituto, mas também fortalecer sua credibilidade e incentivar a participação de voluntários e doadores. Mesmo que a implementação prática ainda não seja realizada, o projeto apresenta viabilidade técnica e econômica, oferecendo uma solução escalável que poderá ser facilmente adotada pelo Instituto Alma no futuro.</w:t>
+      </w:r>
+    </w:p>
+    <w:p>
+      <w:pPr>
+        <w:spacing w:after="0" w:line="240" w:lineRule="auto"/>
+        <w:rPr>
+          <w:rFonts w:ascii="Arial" w:eastAsia="Arial" w:hAnsi="Arial" w:cs="Arial"/>
+          <w:color w:val="000000" w:themeColor="text1"/>
+          <w:sz w:val="20"/>
+          <w:szCs w:val="20"/>
+        </w:rPr>
+      </w:pPr>
+    </w:p>
+    <w:p>
+      <w:pPr>
+        <w:spacing w:after="0" w:line="240" w:lineRule="auto"/>
+        <w:rPr>
+          <w:rFonts w:ascii="Arial" w:eastAsia="Arial" w:hAnsi="Arial" w:cs="Arial"/>
+          <w:color w:val="000000" w:themeColor="text1"/>
+          <w:sz w:val="20"/>
+          <w:szCs w:val="20"/>
+        </w:rPr>
+      </w:pPr>
+      <w:r>
+        <w:rPr>
+          <w:rFonts w:ascii="Arial" w:eastAsia="Arial" w:hAnsi="Arial" w:cs="Arial"/>
+          <w:b/>
+          <w:color w:val="000000" w:themeColor="text1"/>
           <w:sz w:val="20"/>
           <w:szCs w:val="20"/>
         </w:rPr>
@@ -1983,38 +1872,19 @@
               <w:jc w:val="both"/>
               <w:rPr>
                 <w:rFonts w:ascii="Arial" w:eastAsia="Arial" w:hAnsi="Arial" w:cs="Arial"/>
-                <w:color w:val="000000"/>
-                <w:sz w:val="20"/>
-                <w:szCs w:val="20"/>
-              </w:rPr>
-            </w:pPr>
-            <w:r>
-              <w:rPr>
-                <w:rFonts w:ascii="Arial" w:eastAsia="Arial" w:hAnsi="Arial" w:cs="Arial"/>
-                <w:color w:val="525252" w:themeColor="accent3" w:themeShade="80"/>
-                <w:sz w:val="20"/>
-                <w:szCs w:val="20"/>
-              </w:rPr>
-              <w:t>Inserir os dados neste espaço. Orientações:</w:t>
-            </w:r>
-            <w:r>
-              <w:rPr>
-                <w:rFonts w:ascii="Arial" w:eastAsia="Arial" w:hAnsi="Arial" w:cs="Arial"/>
-                <w:b/>
-                <w:color w:val="525252" w:themeColor="accent3" w:themeShade="80"/>
-                <w:sz w:val="16"/>
-                <w:szCs w:val="16"/>
-              </w:rPr>
-              <w:t xml:space="preserve"> </w:t>
-            </w:r>
-            <w:r>
-              <w:rPr>
-                <w:rFonts w:ascii="Arial" w:eastAsia="Arial" w:hAnsi="Arial" w:cs="Arial"/>
-                <w:color w:val="525252" w:themeColor="accent3" w:themeShade="80"/>
-                <w:sz w:val="20"/>
-                <w:szCs w:val="20"/>
-              </w:rPr>
-              <w:t xml:space="preserve">texto sem parágrafos. Trata-se de um resumo, apresentado de forma sintética, clara, objetiva e concisa, dos pontos mais importantes da proposta do projeto: breve descrição do estudo, o problema a ser focado, público-alvo ou comunidade que será envolvido na ação extensionista, o objetivo geral da ação extensionista, as metodologias a serem utilizadas, as atividades previstas, os resultados esperados, e outras informações que forem consideradas relevantes. Escrever um texto curto. </w:t>
+                <w:color w:val="000000" w:themeColor="text1"/>
+                <w:sz w:val="20"/>
+                <w:szCs w:val="20"/>
+              </w:rPr>
+            </w:pPr>
+            <w:r>
+              <w:rPr>
+                <w:rFonts w:ascii="Arial" w:eastAsia="Arial" w:hAnsi="Arial" w:cs="Arial"/>
+                <w:color w:val="000000" w:themeColor="text1"/>
+                <w:sz w:val="20"/>
+                <w:szCs w:val="20"/>
+              </w:rPr>
+              <w:t>O projeto de extensão propõe a criação de um website responsivo para o Instituto Alma, com o objetivo de aprimorar a comunicação, aumentar a transparência e fortalecer o engajamento social. O público-alvo inclui doadores, voluntários e a comunidade em geral, que terão acesso a informações centralizadas sobre campanhas, projetos e resultados da instituição. Espera-se que a iniciativa proporcione maior visibilidade das ações, reforce a credibilidade institucional e aproxime o Instituto Alma de seu público de forma clara e acessível.</w:t>
             </w:r>
           </w:p>
         </w:tc>
@@ -2027,6 +1897,7 @@
           <w:rFonts w:ascii="Arial" w:eastAsia="Arial" w:hAnsi="Arial" w:cs="Arial"/>
           <w:b/>
           <w:strike/>
+          <w:color w:val="000000" w:themeColor="text1"/>
           <w:sz w:val="20"/>
           <w:szCs w:val="20"/>
         </w:rPr>
@@ -2038,6 +1909,7 @@
         <w:jc w:val="both"/>
         <w:rPr>
           <w:rFonts w:ascii="Arial" w:eastAsia="Arial" w:hAnsi="Arial" w:cs="Arial"/>
+          <w:color w:val="000000" w:themeColor="text1"/>
           <w:sz w:val="20"/>
           <w:szCs w:val="20"/>
         </w:rPr>
@@ -2046,6 +1918,7 @@
         <w:rPr>
           <w:rFonts w:ascii="Arial" w:eastAsia="Arial" w:hAnsi="Arial" w:cs="Arial"/>
           <w:b/>
+          <w:color w:val="000000" w:themeColor="text1"/>
           <w:sz w:val="20"/>
           <w:szCs w:val="20"/>
         </w:rPr>
@@ -2078,55 +1951,19 @@
               <w:jc w:val="both"/>
               <w:rPr>
                 <w:rFonts w:ascii="Arial" w:eastAsia="Arial" w:hAnsi="Arial" w:cs="Arial"/>
-                <w:sz w:val="20"/>
-                <w:szCs w:val="20"/>
-              </w:rPr>
-            </w:pPr>
-            <w:r>
-              <w:rPr>
-                <w:rFonts w:ascii="Arial" w:eastAsia="Arial" w:hAnsi="Arial" w:cs="Arial"/>
-                <w:color w:val="525252" w:themeColor="accent3" w:themeShade="80"/>
-                <w:sz w:val="20"/>
-                <w:szCs w:val="20"/>
-              </w:rPr>
-              <w:t>Inserir os dados neste espaço. Orientações:</w:t>
-            </w:r>
-            <w:r>
-              <w:rPr>
-                <w:rFonts w:ascii="Arial" w:eastAsia="Arial" w:hAnsi="Arial" w:cs="Arial"/>
-                <w:b/>
-                <w:color w:val="525252" w:themeColor="accent3" w:themeShade="80"/>
-                <w:sz w:val="16"/>
-                <w:szCs w:val="16"/>
-              </w:rPr>
-              <w:t xml:space="preserve"> </w:t>
-            </w:r>
-            <w:r>
-              <w:rPr>
-                <w:rFonts w:ascii="Arial" w:eastAsia="Arial" w:hAnsi="Arial" w:cs="Arial"/>
-                <w:color w:val="525252" w:themeColor="accent3" w:themeShade="80"/>
-                <w:sz w:val="20"/>
-                <w:szCs w:val="20"/>
-              </w:rPr>
-              <w:t>apresentar a introdução com base na fundamentação teórica sobre o tema trabalhado e que situe o objeto da intervenção, afirmando sua relevância. Descrever as áreas e ODS impactados, incluir o referencial teórico, usar referências segundo ABNT. Não se trata de uma monografia e sim de uma atividade de extensão, por isso a introdução deve ser clara, objetiva</w:t>
-            </w:r>
-            <w:r>
-              <w:rPr>
-                <w:rFonts w:ascii="Arial" w:eastAsia="Arial" w:hAnsi="Arial" w:cs="Arial"/>
-                <w:color w:val="525252" w:themeColor="accent3" w:themeShade="80"/>
-                <w:sz w:val="20"/>
-                <w:szCs w:val="20"/>
-              </w:rPr>
-              <w:t xml:space="preserve"> </w:t>
-            </w:r>
-            <w:r>
-              <w:rPr>
-                <w:rFonts w:ascii="Arial" w:eastAsia="Arial" w:hAnsi="Arial" w:cs="Arial"/>
-                <w:color w:val="525252" w:themeColor="accent3" w:themeShade="80"/>
-                <w:sz w:val="20"/>
-                <w:szCs w:val="20"/>
-              </w:rPr>
-              <w:t xml:space="preserve">e sintética. </w:t>
+                <w:color w:val="000000" w:themeColor="text1"/>
+                <w:sz w:val="20"/>
+                <w:szCs w:val="20"/>
+              </w:rPr>
+            </w:pPr>
+            <w:r>
+              <w:rPr>
+                <w:rFonts w:ascii="Arial" w:eastAsia="Arial" w:hAnsi="Arial" w:cs="Arial"/>
+                <w:color w:val="000000" w:themeColor="text1"/>
+                <w:sz w:val="20"/>
+                <w:szCs w:val="20"/>
+              </w:rPr>
+              <w:t>A presença digital se tornou essencial para organizações que buscam maior visibilidade e engajamento social. O Instituto Alma, que realiza ações de impacto comunitário, enfrenta desafios na divulgação de suas atividades e na comunicação com voluntários e apoiadores. Este projeto propõe o desenvolvimento de um website interativo, capaz de reunir informações relevantes, facilitar o acesso à comunidade e fortalecer a imagem da instituição. A iniciativa também busca incentivar a participação cidadã e promover práticas de transparência, contribuindo para a construção de uma relação mais próxima entre a sociedade e o instituto.</w:t>
             </w:r>
           </w:p>
         </w:tc>
@@ -2138,17 +1975,19 @@
         <w:rPr>
           <w:rFonts w:ascii="Arial" w:eastAsia="Arial" w:hAnsi="Arial" w:cs="Arial"/>
           <w:b/>
-          <w:sz w:val="20"/>
-          <w:szCs w:val="20"/>
-        </w:rPr>
-      </w:pPr>
-    </w:p>
-    <w:p>
-      <w:pPr>
-        <w:spacing w:after="0" w:line="240" w:lineRule="auto"/>
-        <w:rPr>
-          <w:rFonts w:ascii="Arial" w:eastAsia="Arial" w:hAnsi="Arial" w:cs="Arial"/>
-          <w:b/>
+          <w:color w:val="000000" w:themeColor="text1"/>
+          <w:sz w:val="20"/>
+          <w:szCs w:val="20"/>
+        </w:rPr>
+      </w:pPr>
+    </w:p>
+    <w:p>
+      <w:pPr>
+        <w:spacing w:after="0" w:line="240" w:lineRule="auto"/>
+        <w:rPr>
+          <w:rFonts w:ascii="Arial" w:eastAsia="Arial" w:hAnsi="Arial" w:cs="Arial"/>
+          <w:b/>
+          <w:color w:val="000000" w:themeColor="text1"/>
           <w:sz w:val="20"/>
           <w:szCs w:val="20"/>
         </w:rPr>
@@ -2157,6 +1996,7 @@
         <w:rPr>
           <w:rFonts w:ascii="Arial" w:eastAsia="Arial" w:hAnsi="Arial" w:cs="Arial"/>
           <w:b/>
+          <w:color w:val="000000" w:themeColor="text1"/>
           <w:sz w:val="20"/>
           <w:szCs w:val="20"/>
         </w:rPr>
@@ -2192,39 +2032,175 @@
               <w:jc w:val="both"/>
               <w:rPr>
                 <w:rFonts w:ascii="Arial" w:eastAsia="Arial" w:hAnsi="Arial" w:cs="Arial"/>
-                <w:color w:val="FF3333"/>
-                <w:sz w:val="20"/>
-                <w:szCs w:val="20"/>
-              </w:rPr>
-            </w:pPr>
-            <w:r>
-              <w:rPr>
-                <w:rFonts w:ascii="Arial" w:eastAsia="Arial" w:hAnsi="Arial" w:cs="Arial"/>
-                <w:color w:val="525252" w:themeColor="accent3" w:themeShade="80"/>
-                <w:sz w:val="20"/>
-                <w:szCs w:val="20"/>
-              </w:rPr>
-              <w:t>Inserir os dados neste espaço. Orientações:</w:t>
-            </w:r>
-            <w:r>
-              <w:rPr>
-                <w:rFonts w:ascii="Arial" w:eastAsia="Arial" w:hAnsi="Arial" w:cs="Arial"/>
-                <w:b/>
-                <w:color w:val="525252" w:themeColor="accent3" w:themeShade="80"/>
-                <w:sz w:val="16"/>
-                <w:szCs w:val="16"/>
-              </w:rPr>
-              <w:t xml:space="preserve"> </w:t>
-            </w:r>
-            <w:r>
-              <w:rPr>
-                <w:rFonts w:ascii="Arial" w:eastAsia="Arial" w:hAnsi="Arial" w:cs="Arial"/>
-                <w:color w:val="525252" w:themeColor="accent3" w:themeShade="80"/>
-                <w:sz w:val="20"/>
-                <w:szCs w:val="20"/>
-              </w:rPr>
-              <w:t>Descrever os objetivos de forma clara. Cada objetivo deve ter uma correspondência com os resultados esperados. Devem ser expressos sucintamente, em itens, iniciando a frase com verbo de ação e não em forma de relatos.</w:t>
-            </w:r>
+                <w:color w:val="000000" w:themeColor="text1"/>
+                <w:sz w:val="20"/>
+                <w:szCs w:val="20"/>
+              </w:rPr>
+            </w:pPr>
+            <w:r>
+              <w:rPr>
+                <w:rFonts w:ascii="Arial" w:eastAsia="Arial" w:hAnsi="Arial" w:cs="Arial"/>
+                <w:color w:val="000000" w:themeColor="text1"/>
+                <w:sz w:val="20"/>
+                <w:szCs w:val="20"/>
+              </w:rPr>
+              <w:t>O principal objetivo do projeto é criar um portal digital centralizado, que organize e disponibilize informações de maneira clara, promovendo maior engajamento social. Entre os objetivos específicos, destacam-se:</w:t>
+            </w:r>
+          </w:p>
+          <w:p>
+            <w:pPr>
+              <w:numPr>
+                <w:ilvl w:val="0"/>
+                <w:numId w:val="2"/>
+              </w:numPr>
+              <w:tabs>
+                <w:tab w:val="left" w:pos="360"/>
+              </w:tabs>
+              <w:spacing w:after="0" w:line="240" w:lineRule="auto"/>
+              <w:jc w:val="both"/>
+              <w:rPr>
+                <w:rFonts w:ascii="Arial" w:eastAsia="Arial" w:hAnsi="Arial" w:cs="Arial"/>
+                <w:color w:val="000000" w:themeColor="text1"/>
+                <w:sz w:val="20"/>
+                <w:szCs w:val="20"/>
+              </w:rPr>
+            </w:pPr>
+            <w:r>
+              <w:rPr>
+                <w:rFonts w:ascii="Arial" w:eastAsia="Arial" w:hAnsi="Arial" w:cs="Arial"/>
+                <w:color w:val="000000" w:themeColor="text1"/>
+                <w:sz w:val="20"/>
+                <w:szCs w:val="20"/>
+              </w:rPr>
+              <w:t>Apresentar de forma acessível e clara as campanhas, projetos e resultados do Instituto Alma.</w:t>
+            </w:r>
+          </w:p>
+          <w:p>
+            <w:pPr>
+              <w:numPr>
+                <w:ilvl w:val="0"/>
+                <w:numId w:val="2"/>
+              </w:numPr>
+              <w:tabs>
+                <w:tab w:val="left" w:pos="360"/>
+              </w:tabs>
+              <w:spacing w:after="0" w:line="240" w:lineRule="auto"/>
+              <w:jc w:val="both"/>
+              <w:rPr>
+                <w:rFonts w:ascii="Arial" w:eastAsia="Arial" w:hAnsi="Arial" w:cs="Arial"/>
+                <w:color w:val="000000" w:themeColor="text1"/>
+                <w:sz w:val="20"/>
+                <w:szCs w:val="20"/>
+              </w:rPr>
+            </w:pPr>
+            <w:r>
+              <w:rPr>
+                <w:rFonts w:ascii="Arial" w:eastAsia="Arial" w:hAnsi="Arial" w:cs="Arial"/>
+                <w:color w:val="000000" w:themeColor="text1"/>
+                <w:sz w:val="20"/>
+                <w:szCs w:val="20"/>
+              </w:rPr>
+              <w:t>Criar mecanismos para que voluntários e doadores se envolvam de forma prática com a instituição.</w:t>
+            </w:r>
+          </w:p>
+          <w:p>
+            <w:pPr>
+              <w:numPr>
+                <w:ilvl w:val="0"/>
+                <w:numId w:val="2"/>
+              </w:numPr>
+              <w:tabs>
+                <w:tab w:val="left" w:pos="360"/>
+              </w:tabs>
+              <w:spacing w:after="0" w:line="240" w:lineRule="auto"/>
+              <w:jc w:val="both"/>
+              <w:rPr>
+                <w:rFonts w:ascii="Arial" w:eastAsia="Arial" w:hAnsi="Arial" w:cs="Arial"/>
+                <w:color w:val="000000" w:themeColor="text1"/>
+                <w:sz w:val="20"/>
+                <w:szCs w:val="20"/>
+              </w:rPr>
+            </w:pPr>
+            <w:r>
+              <w:rPr>
+                <w:rFonts w:ascii="Arial" w:eastAsia="Arial" w:hAnsi="Arial" w:cs="Arial"/>
+                <w:color w:val="000000" w:themeColor="text1"/>
+                <w:sz w:val="20"/>
+                <w:szCs w:val="20"/>
+              </w:rPr>
+              <w:t>Garantir que a navegação seja intuitiva, promovendo uma experiência satisfatória para todos os usuários.</w:t>
+            </w:r>
+          </w:p>
+          <w:p>
+            <w:pPr>
+              <w:numPr>
+                <w:ilvl w:val="0"/>
+                <w:numId w:val="2"/>
+              </w:numPr>
+              <w:tabs>
+                <w:tab w:val="left" w:pos="360"/>
+              </w:tabs>
+              <w:spacing w:after="0" w:line="240" w:lineRule="auto"/>
+              <w:jc w:val="both"/>
+              <w:rPr>
+                <w:rFonts w:ascii="Arial" w:eastAsia="Arial" w:hAnsi="Arial" w:cs="Arial"/>
+                <w:color w:val="000000" w:themeColor="text1"/>
+                <w:sz w:val="20"/>
+                <w:szCs w:val="20"/>
+              </w:rPr>
+            </w:pPr>
+            <w:r>
+              <w:rPr>
+                <w:rFonts w:ascii="Arial" w:eastAsia="Arial" w:hAnsi="Arial" w:cs="Arial"/>
+                <w:color w:val="000000" w:themeColor="text1"/>
+                <w:sz w:val="20"/>
+                <w:szCs w:val="20"/>
+              </w:rPr>
+              <w:t>Proporcionar transparência e confiabilidade nas informações disponibilizadas.</w:t>
+            </w:r>
+          </w:p>
+          <w:p>
+            <w:pPr>
+              <w:numPr>
+                <w:ilvl w:val="0"/>
+                <w:numId w:val="2"/>
+              </w:numPr>
+              <w:tabs>
+                <w:tab w:val="left" w:pos="360"/>
+              </w:tabs>
+              <w:spacing w:after="0" w:line="240" w:lineRule="auto"/>
+              <w:jc w:val="both"/>
+              <w:rPr>
+                <w:rFonts w:ascii="Arial" w:eastAsia="Arial" w:hAnsi="Arial" w:cs="Arial"/>
+                <w:color w:val="000000" w:themeColor="text1"/>
+                <w:sz w:val="20"/>
+                <w:szCs w:val="20"/>
+              </w:rPr>
+            </w:pPr>
+            <w:r>
+              <w:rPr>
+                <w:rFonts w:ascii="Arial" w:eastAsia="Arial" w:hAnsi="Arial" w:cs="Arial"/>
+                <w:color w:val="000000" w:themeColor="text1"/>
+                <w:sz w:val="20"/>
+                <w:szCs w:val="20"/>
+              </w:rPr>
+              <w:t>Permitir que a instituição mantenha o conteúdo atualizado e relevante de maneira contínua.</w:t>
+            </w:r>
+          </w:p>
+          <w:p>
+            <w:pPr>
+              <w:tabs>
+                <w:tab w:val="left" w:pos="360"/>
+              </w:tabs>
+              <w:spacing w:after="0" w:line="240" w:lineRule="auto"/>
+              <w:jc w:val="both"/>
+              <w:rPr>
+                <w:rFonts w:ascii="Arial" w:eastAsia="Arial" w:hAnsi="Arial" w:cs="Arial"/>
+                <w:color w:val="000000" w:themeColor="text1"/>
+                <w:sz w:val="20"/>
+                <w:szCs w:val="20"/>
+              </w:rPr>
+            </w:pPr>
           </w:p>
         </w:tc>
       </w:tr>
@@ -2234,16 +2210,18 @@
         <w:spacing w:after="0" w:line="240" w:lineRule="auto"/>
         <w:rPr>
           <w:rFonts w:ascii="Arial" w:eastAsia="Arial" w:hAnsi="Arial" w:cs="Arial"/>
-          <w:sz w:val="20"/>
-          <w:szCs w:val="20"/>
-        </w:rPr>
-      </w:pPr>
-    </w:p>
-    <w:p>
-      <w:pPr>
-        <w:spacing w:after="0" w:line="240" w:lineRule="auto"/>
-        <w:rPr>
-          <w:rFonts w:ascii="Arial" w:eastAsia="Arial" w:hAnsi="Arial" w:cs="Arial"/>
+          <w:color w:val="000000" w:themeColor="text1"/>
+          <w:sz w:val="20"/>
+          <w:szCs w:val="20"/>
+        </w:rPr>
+      </w:pPr>
+    </w:p>
+    <w:p>
+      <w:pPr>
+        <w:spacing w:after="0" w:line="240" w:lineRule="auto"/>
+        <w:rPr>
+          <w:rFonts w:ascii="Arial" w:eastAsia="Arial" w:hAnsi="Arial" w:cs="Arial"/>
+          <w:color w:val="000000" w:themeColor="text1"/>
           <w:sz w:val="20"/>
           <w:szCs w:val="20"/>
         </w:rPr>
@@ -2252,6 +2230,7 @@
         <w:rPr>
           <w:rFonts w:ascii="Arial" w:eastAsia="Arial" w:hAnsi="Arial" w:cs="Arial"/>
           <w:b/>
+          <w:color w:val="000000" w:themeColor="text1"/>
           <w:sz w:val="20"/>
           <w:szCs w:val="20"/>
         </w:rPr>
@@ -2284,37 +2263,19 @@
               <w:jc w:val="both"/>
               <w:rPr>
                 <w:rFonts w:ascii="Arial" w:eastAsia="Arial" w:hAnsi="Arial" w:cs="Arial"/>
-                <w:sz w:val="20"/>
-                <w:szCs w:val="20"/>
-              </w:rPr>
-            </w:pPr>
-            <w:r>
-              <w:rPr>
-                <w:rFonts w:ascii="Arial" w:eastAsia="Arial" w:hAnsi="Arial" w:cs="Arial"/>
-                <w:color w:val="525252" w:themeColor="accent3" w:themeShade="80"/>
-                <w:sz w:val="20"/>
-                <w:szCs w:val="20"/>
-              </w:rPr>
-              <w:t>Inserir os dados neste espaço. Orientações:</w:t>
-            </w:r>
-            <w:r>
-              <w:rPr>
-                <w:rFonts w:ascii="Arial" w:eastAsia="Arial" w:hAnsi="Arial" w:cs="Arial"/>
-                <w:b/>
-                <w:color w:val="525252" w:themeColor="accent3" w:themeShade="80"/>
-                <w:sz w:val="16"/>
-                <w:szCs w:val="16"/>
-              </w:rPr>
-              <w:t xml:space="preserve"> </w:t>
-            </w:r>
-            <w:r>
-              <w:rPr>
-                <w:rFonts w:ascii="Arial" w:eastAsia="Arial" w:hAnsi="Arial" w:cs="Arial"/>
-                <w:color w:val="525252" w:themeColor="accent3" w:themeShade="80"/>
-                <w:sz w:val="20"/>
-                <w:szCs w:val="20"/>
-              </w:rPr>
-              <w:t xml:space="preserve">descrever como ocorrerá a ação extensionista junto ao público-alvo. Trata-se descrição sobre como será realizada a prática da ação extensionista, é o detalhamento do caminho a ser percorrido pela equipe em sua interação com a sociedade. Descrever os métodos, técnicas e estratégias para a implementação das atividades de intervenção previstas no projeto e sua contribuição para o alcance dos objetivos. Descrever o local, público-alvo, ferramentas empregadas para a relação dialógica com a comunidade ou setores da sociedade: visitas, entrevistas, questionários, reuniões, roda de conversa, ou uso de outras ferramentas de levantamento. Detalhar os procedimentos e as atividades a serem implementadas. </w:t>
+                <w:color w:val="000000" w:themeColor="text1"/>
+                <w:sz w:val="20"/>
+                <w:szCs w:val="20"/>
+              </w:rPr>
+            </w:pPr>
+            <w:r>
+              <w:rPr>
+                <w:rFonts w:ascii="Arial" w:eastAsia="Arial" w:hAnsi="Arial" w:cs="Arial"/>
+                <w:color w:val="000000" w:themeColor="text1"/>
+                <w:sz w:val="20"/>
+                <w:szCs w:val="20"/>
+              </w:rPr>
+              <w:t>O projeto será desenvolvido em parceria com o Instituto Alma, envolvendo etapas de levantamento de necessidades, planejamento, prototipagem e acompanhamento contínuo da equipe do instituto. Inicialmente, serão realizadas entrevistas e reuniões para compreender as demandas de comunicação e engajamento. Com base nesses dados, será criado o website, estruturado em seções que centralizem informações sobre projetos, campanhas e relatórios, garantindo que a plataforma atenda às expectativas do público.</w:t>
             </w:r>
           </w:p>
         </w:tc>
@@ -2325,16 +2286,18 @@
         <w:spacing w:after="0" w:line="240" w:lineRule="auto"/>
         <w:rPr>
           <w:rFonts w:ascii="Arial" w:eastAsia="Arial" w:hAnsi="Arial" w:cs="Arial"/>
-          <w:sz w:val="20"/>
-          <w:szCs w:val="20"/>
-        </w:rPr>
-      </w:pPr>
-    </w:p>
-    <w:p>
-      <w:pPr>
-        <w:spacing w:after="0" w:line="240" w:lineRule="auto"/>
-        <w:rPr>
-          <w:rFonts w:ascii="Arial" w:eastAsia="Arial" w:hAnsi="Arial" w:cs="Arial"/>
+          <w:color w:val="000000" w:themeColor="text1"/>
+          <w:sz w:val="20"/>
+          <w:szCs w:val="20"/>
+        </w:rPr>
+      </w:pPr>
+    </w:p>
+    <w:p>
+      <w:pPr>
+        <w:spacing w:after="0" w:line="240" w:lineRule="auto"/>
+        <w:rPr>
+          <w:rFonts w:ascii="Arial" w:eastAsia="Arial" w:hAnsi="Arial" w:cs="Arial"/>
+          <w:color w:val="000000" w:themeColor="text1"/>
           <w:sz w:val="20"/>
           <w:szCs w:val="20"/>
         </w:rPr>
@@ -2343,6 +2306,7 @@
         <w:rPr>
           <w:rFonts w:ascii="Arial" w:eastAsia="Arial" w:hAnsi="Arial" w:cs="Arial"/>
           <w:b/>
+          <w:color w:val="000000" w:themeColor="text1"/>
           <w:sz w:val="20"/>
           <w:szCs w:val="20"/>
         </w:rPr>
@@ -2376,18 +2340,19 @@
               <w:jc w:val="both"/>
               <w:rPr>
                 <w:rFonts w:ascii="Arial" w:eastAsia="Arial" w:hAnsi="Arial" w:cs="Arial"/>
-                <w:sz w:val="20"/>
-                <w:szCs w:val="20"/>
-              </w:rPr>
-            </w:pPr>
-            <w:r>
-              <w:rPr>
-                <w:rFonts w:ascii="Arial" w:eastAsia="Arial" w:hAnsi="Arial" w:cs="Arial"/>
-                <w:color w:val="525252" w:themeColor="accent3" w:themeShade="80"/>
-                <w:sz w:val="20"/>
-                <w:szCs w:val="20"/>
-              </w:rPr>
-              <w:t xml:space="preserve">Inserir os dados neste espaço. Orientações: este item pode ser apresentado como resultados parciais, ou resultados finais para projetos implementados, ou, ainda, resultados esperados para propostas de projetos. Descrever de forma objetiva de que modo o projeto espera modificar as condições inicialmente diagnosticadas no público-alvo envolvido. Trata-se de uma projeção dos impactos sociais esperados ou desejados, considerando que a extensão universitária busca estar atenta aos interesses e necessidades da maioria da população, buscando superar desigualdades, garantir diversidade, evitar exclusões, implementar o desenvolvimento regional e desenvolver políticas públicas. </w:t>
+                <w:color w:val="000000" w:themeColor="text1"/>
+                <w:sz w:val="20"/>
+                <w:szCs w:val="20"/>
+              </w:rPr>
+            </w:pPr>
+            <w:r>
+              <w:rPr>
+                <w:rFonts w:ascii="Arial" w:eastAsia="Arial" w:hAnsi="Arial" w:cs="Arial"/>
+                <w:color w:val="000000" w:themeColor="text1"/>
+                <w:sz w:val="20"/>
+                <w:szCs w:val="20"/>
+              </w:rPr>
+              <w:t>Espera-se que a plataforma proporcione maior clareza, transparência e engajamento para o Instituto Alma. O website deverá facilitar o acesso às informações, ampliar a participação de voluntários e doadores, aumentar a visibilidade das ações sociais e consolidar a imagem da instituição junto à comunidade. A iniciativa pretende aproximar a sociedade das causas do instituto, promovendo impacto positivo e incentivando práticas solidárias.</w:t>
             </w:r>
           </w:p>
         </w:tc>
@@ -2399,16 +2364,18 @@
         <w:rPr>
           <w:rFonts w:ascii="Arial" w:eastAsia="Arial" w:hAnsi="Arial" w:cs="Arial"/>
           <w:b/>
-          <w:sz w:val="20"/>
-          <w:szCs w:val="20"/>
-        </w:rPr>
-      </w:pPr>
-    </w:p>
-    <w:p>
-      <w:pPr>
-        <w:spacing w:after="0" w:line="240" w:lineRule="auto"/>
-        <w:rPr>
-          <w:rFonts w:ascii="Arial" w:eastAsia="Arial" w:hAnsi="Arial" w:cs="Arial"/>
+          <w:color w:val="000000" w:themeColor="text1"/>
+          <w:sz w:val="20"/>
+          <w:szCs w:val="20"/>
+        </w:rPr>
+      </w:pPr>
+    </w:p>
+    <w:p>
+      <w:pPr>
+        <w:spacing w:after="0" w:line="240" w:lineRule="auto"/>
+        <w:rPr>
+          <w:rFonts w:ascii="Arial" w:eastAsia="Arial" w:hAnsi="Arial" w:cs="Arial"/>
+          <w:color w:val="000000" w:themeColor="text1"/>
           <w:sz w:val="20"/>
           <w:szCs w:val="20"/>
         </w:rPr>
@@ -2417,6 +2384,7 @@
         <w:rPr>
           <w:rFonts w:ascii="Arial" w:eastAsia="Arial" w:hAnsi="Arial" w:cs="Arial"/>
           <w:b/>
+          <w:color w:val="000000" w:themeColor="text1"/>
           <w:sz w:val="20"/>
           <w:szCs w:val="20"/>
         </w:rPr>
@@ -2452,38 +2420,19 @@
               <w:jc w:val="both"/>
               <w:rPr>
                 <w:rFonts w:ascii="Arial" w:eastAsia="Arial" w:hAnsi="Arial" w:cs="Arial"/>
-                <w:color w:val="FF3333"/>
-                <w:sz w:val="20"/>
-                <w:szCs w:val="20"/>
-              </w:rPr>
-            </w:pPr>
-            <w:r>
-              <w:rPr>
-                <w:rFonts w:ascii="Arial" w:eastAsia="Arial" w:hAnsi="Arial" w:cs="Arial"/>
-                <w:color w:val="525252" w:themeColor="accent3" w:themeShade="80"/>
-                <w:sz w:val="20"/>
-                <w:szCs w:val="20"/>
-              </w:rPr>
-              <w:t>Inserir os dados neste espaço. Orientações:</w:t>
-            </w:r>
-            <w:r>
-              <w:rPr>
-                <w:rFonts w:ascii="Arial" w:eastAsia="Arial" w:hAnsi="Arial" w:cs="Arial"/>
-                <w:b/>
-                <w:color w:val="525252" w:themeColor="accent3" w:themeShade="80"/>
-                <w:sz w:val="16"/>
-                <w:szCs w:val="16"/>
-              </w:rPr>
-              <w:t xml:space="preserve"> </w:t>
-            </w:r>
-            <w:r>
-              <w:rPr>
-                <w:rFonts w:ascii="Arial" w:eastAsia="Arial" w:hAnsi="Arial" w:cs="Arial"/>
-                <w:color w:val="525252" w:themeColor="accent3" w:themeShade="80"/>
-                <w:sz w:val="20"/>
-                <w:szCs w:val="20"/>
-              </w:rPr>
-              <w:t>é o desfecho do projeto devendo responder o problema central do trabalho e destacar se o trabalho atendeu aos objetivos propostos, destacando os principais pontos e direções para futuras ações.</w:t>
+                <w:color w:val="000000" w:themeColor="text1"/>
+                <w:sz w:val="20"/>
+                <w:szCs w:val="20"/>
+              </w:rPr>
+            </w:pPr>
+            <w:r>
+              <w:rPr>
+                <w:rFonts w:ascii="Arial" w:eastAsia="Arial" w:hAnsi="Arial" w:cs="Arial"/>
+                <w:color w:val="000000" w:themeColor="text1"/>
+                <w:sz w:val="20"/>
+                <w:szCs w:val="20"/>
+              </w:rPr>
+              <w:t>O projeto busca fortalecer a presença digital do Instituto Alma, tornando suas ações mais acessíveis e compreensíveis para a comunidade. A iniciativa contribui para uma comunicação mais transparente, aproxima voluntários e doadores das atividades da instituição e cria oportunidades para o fortalecimento da participação social. Além disso, abre caminho para futuras melhorias na plataforma e novas iniciativas que promovam engajamento e inclusão social.</w:t>
             </w:r>
           </w:p>
         </w:tc>
@@ -2494,17 +2443,44 @@
         <w:spacing w:after="0" w:line="240" w:lineRule="auto"/>
         <w:rPr>
           <w:rFonts w:ascii="Arial" w:eastAsia="Arial" w:hAnsi="Arial" w:cs="Arial"/>
-          <w:sz w:val="20"/>
-          <w:szCs w:val="20"/>
-        </w:rPr>
-      </w:pPr>
-    </w:p>
-    <w:p>
-      <w:pPr>
-        <w:spacing w:after="0" w:line="240" w:lineRule="auto"/>
-        <w:rPr>
-          <w:rFonts w:ascii="Arial" w:eastAsia="Arial" w:hAnsi="Arial" w:cs="Arial"/>
-          <w:b/>
+          <w:color w:val="000000" w:themeColor="text1"/>
+          <w:sz w:val="20"/>
+          <w:szCs w:val="20"/>
+        </w:rPr>
+      </w:pPr>
+    </w:p>
+    <w:p>
+      <w:pPr>
+        <w:spacing w:after="0" w:line="240" w:lineRule="auto"/>
+        <w:rPr>
+          <w:rFonts w:ascii="Arial" w:eastAsia="Arial" w:hAnsi="Arial" w:cs="Arial"/>
+          <w:b/>
+          <w:color w:val="000000" w:themeColor="text1"/>
+          <w:sz w:val="20"/>
+          <w:szCs w:val="20"/>
+        </w:rPr>
+      </w:pPr>
+    </w:p>
+    <w:p>
+      <w:pPr>
+        <w:spacing w:after="0" w:line="240" w:lineRule="auto"/>
+        <w:rPr>
+          <w:rFonts w:ascii="Arial" w:eastAsia="Arial" w:hAnsi="Arial" w:cs="Arial"/>
+          <w:b/>
+          <w:color w:val="000000" w:themeColor="text1"/>
+          <w:sz w:val="20"/>
+          <w:szCs w:val="20"/>
+        </w:rPr>
+      </w:pPr>
+    </w:p>
+    <w:p>
+      <w:pPr>
+        <w:spacing w:after="0" w:line="240" w:lineRule="auto"/>
+        <w:jc w:val="center"/>
+        <w:rPr>
+          <w:rFonts w:ascii="Arial" w:eastAsia="Arial" w:hAnsi="Arial" w:cs="Arial"/>
+          <w:b/>
+          <w:color w:val="000000" w:themeColor="text1"/>
           <w:sz w:val="20"/>
           <w:szCs w:val="20"/>
         </w:rPr>
@@ -2513,137 +2489,7 @@
         <w:rPr>
           <w:rFonts w:ascii="Arial" w:eastAsia="Arial" w:hAnsi="Arial" w:cs="Arial"/>
           <w:b/>
-          <w:sz w:val="20"/>
-          <w:szCs w:val="20"/>
-        </w:rPr>
-        <w:t xml:space="preserve">Referências </w:t>
-      </w:r>
-    </w:p>
-    <w:tbl>
-      <w:tblPr>
-        <w:tblW w:w="9300" w:type="dxa"/>
-        <w:tblLayout w:type="fixed"/>
-        <w:tblLook w:val="0000" w:firstRow="0" w:lastRow="0" w:firstColumn="0" w:lastColumn="0" w:noHBand="0" w:noVBand="0"/>
-      </w:tblPr>
-      <w:tblGrid>
-        <w:gridCol w:w="9300"/>
-      </w:tblGrid>
-      <w:tr>
-        <w:tc>
-          <w:tcPr>
-            <w:tcW w:w="9300" w:type="dxa"/>
-            <w:tcBorders>
-              <w:top w:val="single" w:sz="4" w:space="0" w:color="000000"/>
-              <w:left w:val="single" w:sz="4" w:space="0" w:color="000000"/>
-              <w:bottom w:val="single" w:sz="4" w:space="0" w:color="000000"/>
-              <w:right w:val="single" w:sz="4" w:space="0" w:color="000000"/>
-            </w:tcBorders>
-          </w:tcPr>
-          <w:p>
-            <w:pPr>
-              <w:spacing w:after="0" w:line="240" w:lineRule="auto"/>
-              <w:rPr>
-                <w:rFonts w:ascii="Arial" w:eastAsia="Arial" w:hAnsi="Arial" w:cs="Arial"/>
-                <w:color w:val="1F4E79"/>
-                <w:sz w:val="20"/>
-                <w:szCs w:val="20"/>
-              </w:rPr>
-            </w:pPr>
-            <w:r>
-              <w:rPr>
-                <w:rFonts w:ascii="Arial" w:eastAsia="Arial" w:hAnsi="Arial" w:cs="Arial"/>
-                <w:color w:val="525252" w:themeColor="accent3" w:themeShade="80"/>
-                <w:sz w:val="20"/>
-                <w:szCs w:val="20"/>
-              </w:rPr>
-              <w:t>Inserir os dados neste espaço. Orientações: Adotar a versão atual da ABNT.</w:t>
-            </w:r>
-          </w:p>
-        </w:tc>
-      </w:tr>
-    </w:tbl>
-    <w:p>
-      <w:pPr>
-        <w:spacing w:after="0" w:line="240" w:lineRule="auto"/>
-        <w:rPr>
-          <w:rFonts w:ascii="Arial" w:eastAsia="Arial" w:hAnsi="Arial" w:cs="Arial"/>
-          <w:b/>
-          <w:sz w:val="20"/>
-          <w:szCs w:val="20"/>
-        </w:rPr>
-      </w:pPr>
-    </w:p>
-    <w:p>
-      <w:pPr>
-        <w:spacing w:after="0" w:line="240" w:lineRule="auto"/>
-        <w:rPr>
-          <w:rFonts w:ascii="Arial" w:eastAsia="Arial" w:hAnsi="Arial" w:cs="Arial"/>
-          <w:b/>
-          <w:sz w:val="20"/>
-          <w:szCs w:val="20"/>
-        </w:rPr>
-      </w:pPr>
-    </w:p>
-    <w:p>
-      <w:pPr>
-        <w:spacing w:after="0" w:line="240" w:lineRule="auto"/>
-        <w:rPr>
-          <w:rFonts w:ascii="Arial" w:eastAsia="Arial" w:hAnsi="Arial" w:cs="Arial"/>
-          <w:b/>
-          <w:sz w:val="20"/>
-          <w:szCs w:val="20"/>
-        </w:rPr>
-      </w:pPr>
-    </w:p>
-    <w:p>
-      <w:pPr>
-        <w:spacing w:after="0" w:line="240" w:lineRule="auto"/>
-        <w:rPr>
-          <w:rFonts w:ascii="Arial" w:eastAsia="Arial" w:hAnsi="Arial" w:cs="Arial"/>
-          <w:b/>
-          <w:sz w:val="20"/>
-          <w:szCs w:val="20"/>
-        </w:rPr>
-      </w:pPr>
-    </w:p>
-    <w:p>
-      <w:pPr>
-        <w:spacing w:after="0" w:line="240" w:lineRule="auto"/>
-        <w:rPr>
-          <w:rFonts w:ascii="Arial" w:eastAsia="Arial" w:hAnsi="Arial" w:cs="Arial"/>
-          <w:b/>
-          <w:sz w:val="20"/>
-          <w:szCs w:val="20"/>
-        </w:rPr>
-      </w:pPr>
-    </w:p>
-    <w:p>
-      <w:pPr>
-        <w:spacing w:after="0" w:line="240" w:lineRule="auto"/>
-        <w:jc w:val="center"/>
-        <w:rPr>
-          <w:rFonts w:ascii="Arial" w:eastAsia="Arial" w:hAnsi="Arial" w:cs="Arial"/>
-          <w:b/>
-          <w:sz w:val="20"/>
-          <w:szCs w:val="20"/>
-        </w:rPr>
-      </w:pPr>
-    </w:p>
-    <w:p>
-      <w:pPr>
-        <w:spacing w:after="0" w:line="240" w:lineRule="auto"/>
-        <w:jc w:val="center"/>
-        <w:rPr>
-          <w:rFonts w:ascii="Arial" w:eastAsia="Arial" w:hAnsi="Arial" w:cs="Arial"/>
-          <w:b/>
-          <w:sz w:val="20"/>
-          <w:szCs w:val="20"/>
-        </w:rPr>
-      </w:pPr>
-      <w:r>
-        <w:rPr>
-          <w:rFonts w:ascii="Arial" w:eastAsia="Arial" w:hAnsi="Arial" w:cs="Arial"/>
-          <w:b/>
+          <w:color w:val="000000" w:themeColor="text1"/>
           <w:sz w:val="20"/>
           <w:szCs w:val="20"/>
         </w:rPr>
@@ -2657,6 +2503,7 @@
         <w:rPr>
           <w:rFonts w:ascii="Arial" w:eastAsia="Arial" w:hAnsi="Arial" w:cs="Arial"/>
           <w:b/>
+          <w:color w:val="000000" w:themeColor="text1"/>
           <w:sz w:val="20"/>
           <w:szCs w:val="20"/>
         </w:rPr>
@@ -2690,20 +2537,11 @@
               <w:rPr>
                 <w:rFonts w:ascii="Arial" w:eastAsia="Arial" w:hAnsi="Arial" w:cs="Arial"/>
                 <w:b/>
-                <w:sz w:val="20"/>
-                <w:szCs w:val="20"/>
-              </w:rPr>
-            </w:pPr>
-            <w:r>
-              <w:rPr>
-                <w:rFonts w:ascii="Arial" w:eastAsia="Arial" w:hAnsi="Arial" w:cs="Arial"/>
-                <w:color w:val="525252" w:themeColor="accent3" w:themeShade="80"/>
-                <w:sz w:val="20"/>
-                <w:szCs w:val="20"/>
-                <w:highlight w:val="white"/>
-              </w:rPr>
-              <w:t>As atividades de extensão podem resultar em produto caracterizado a partir do fazer extensionista, sempre mediados pela interação dialógica entre a comunidade acadêmica e a sociedade e seus setores, sendo exemplos: softwares; aplicativos; protótipos; desenhos técnicos; patentes; simuladores; objetos de aprendizagem; games; insumos alternativos; processos e procedimentos operativos inovadores; relatórios; relatos de experiências; cartilhas; revistas; manuais; jornais; informativos; livros; anais; cartazes; artigos; resumos; pôster; banner; site; portal; hotsite; fotografia; vídeos; áudios; tutoriais, dentre outros.</w:t>
-            </w:r>
+                <w:color w:val="000000" w:themeColor="text1"/>
+                <w:sz w:val="20"/>
+                <w:szCs w:val="20"/>
+              </w:rPr>
+            </w:pPr>
           </w:p>
         </w:tc>
       </w:tr>
@@ -2715,6 +2553,7 @@
         <w:rPr>
           <w:rFonts w:ascii="Arial" w:eastAsia="Arial" w:hAnsi="Arial" w:cs="Arial"/>
           <w:b/>
+          <w:color w:val="000000" w:themeColor="text1"/>
           <w:sz w:val="20"/>
           <w:szCs w:val="20"/>
         </w:rPr>
@@ -2727,6 +2566,7 @@
         <w:rPr>
           <w:rFonts w:ascii="Arial" w:eastAsia="Arial" w:hAnsi="Arial" w:cs="Arial"/>
           <w:b/>
+          <w:color w:val="000000" w:themeColor="text1"/>
           <w:sz w:val="20"/>
           <w:szCs w:val="20"/>
         </w:rPr>
@@ -2760,6 +2600,7 @@
               <w:rPr>
                 <w:rFonts w:ascii="Arial" w:eastAsia="Arial" w:hAnsi="Arial" w:cs="Arial"/>
                 <w:b/>
+                <w:color w:val="000000" w:themeColor="text1"/>
                 <w:sz w:val="20"/>
                 <w:szCs w:val="20"/>
               </w:rPr>
@@ -2768,6 +2609,7 @@
               <w:rPr>
                 <w:rFonts w:ascii="Arial" w:eastAsia="Arial" w:hAnsi="Arial" w:cs="Arial"/>
                 <w:b/>
+                <w:color w:val="000000" w:themeColor="text1"/>
                 <w:sz w:val="20"/>
                 <w:szCs w:val="20"/>
               </w:rPr>
@@ -2784,6 +2626,7 @@
               <w:rPr>
                 <w:rFonts w:ascii="Arial" w:eastAsia="Arial" w:hAnsi="Arial" w:cs="Arial"/>
                 <w:b/>
+                <w:color w:val="000000" w:themeColor="text1"/>
                 <w:sz w:val="20"/>
                 <w:szCs w:val="20"/>
               </w:rPr>
@@ -2792,6 +2635,7 @@
               <w:rPr>
                 <w:rFonts w:ascii="Arial" w:eastAsia="Arial" w:hAnsi="Arial" w:cs="Arial"/>
                 <w:b/>
+                <w:color w:val="000000" w:themeColor="text1"/>
                 <w:sz w:val="20"/>
                 <w:szCs w:val="20"/>
               </w:rPr>
@@ -2806,6 +2650,7 @@
         <w:spacing w:after="0" w:line="240" w:lineRule="auto"/>
         <w:rPr>
           <w:rFonts w:ascii="Arial" w:eastAsia="Arial" w:hAnsi="Arial" w:cs="Arial"/>
+          <w:color w:val="000000" w:themeColor="text1"/>
           <w:sz w:val="20"/>
           <w:szCs w:val="20"/>
         </w:rPr>
@@ -2839,6 +2684,7 @@
               <w:rPr>
                 <w:rFonts w:ascii="Arial" w:eastAsia="Arial" w:hAnsi="Arial" w:cs="Arial"/>
                 <w:b/>
+                <w:color w:val="000000" w:themeColor="text1"/>
                 <w:sz w:val="20"/>
                 <w:szCs w:val="20"/>
               </w:rPr>
@@ -2847,9 +2693,11 @@
               <w:rPr>
                 <w:rFonts w:ascii="Arial" w:eastAsia="Arial" w:hAnsi="Arial" w:cs="Arial"/>
                 <w:b/>
-                <w:sz w:val="20"/>
-                <w:szCs w:val="20"/>
-              </w:rPr>
+                <w:color w:val="000000" w:themeColor="text1"/>
+                <w:sz w:val="20"/>
+                <w:szCs w:val="20"/>
+              </w:rPr>
+              <w:lastRenderedPageBreak/>
               <w:t>Documentos FECAP</w:t>
             </w:r>
           </w:p>
@@ -2862,6 +2710,7 @@
             <w:pPr>
               <w:rPr>
                 <w:rFonts w:ascii="Arial" w:eastAsia="Arial" w:hAnsi="Arial" w:cs="Arial"/>
+                <w:color w:val="000000" w:themeColor="text1"/>
                 <w:sz w:val="20"/>
                 <w:szCs w:val="20"/>
               </w:rPr>
@@ -2878,17 +2727,18 @@
             <w:pPr>
               <w:rPr>
                 <w:rFonts w:ascii="Arial" w:eastAsia="Arial" w:hAnsi="Arial" w:cs="Arial"/>
-                <w:sz w:val="20"/>
-                <w:szCs w:val="20"/>
-              </w:rPr>
-            </w:pPr>
-            <w:r>
-              <w:rPr>
-                <w:rFonts w:ascii="Arial" w:eastAsia="Arial" w:hAnsi="Arial" w:cs="Arial"/>
-                <w:sz w:val="20"/>
-                <w:szCs w:val="20"/>
-              </w:rPr>
-              <w:lastRenderedPageBreak/>
+                <w:color w:val="000000" w:themeColor="text1"/>
+                <w:sz w:val="20"/>
+                <w:szCs w:val="20"/>
+              </w:rPr>
+            </w:pPr>
+            <w:r>
+              <w:rPr>
+                <w:rFonts w:ascii="Arial" w:eastAsia="Arial" w:hAnsi="Arial" w:cs="Arial"/>
+                <w:color w:val="000000" w:themeColor="text1"/>
+                <w:sz w:val="20"/>
+                <w:szCs w:val="20"/>
+              </w:rPr>
               <w:t>Regulamento das Atividade de Extensão</w:t>
             </w:r>
           </w:p>
@@ -2901,6 +2751,7 @@
             <w:pPr>
               <w:rPr>
                 <w:rFonts w:ascii="Arial" w:eastAsia="Arial" w:hAnsi="Arial" w:cs="Arial"/>
+                <w:color w:val="000000" w:themeColor="text1"/>
                 <w:sz w:val="20"/>
                 <w:szCs w:val="20"/>
               </w:rPr>
@@ -2914,17 +2765,25 @@
         <w:spacing w:after="0" w:line="240" w:lineRule="auto"/>
         <w:rPr>
           <w:rFonts w:ascii="Arial" w:eastAsia="Arial" w:hAnsi="Arial" w:cs="Arial"/>
-          <w:sz w:val="20"/>
-          <w:szCs w:val="20"/>
-        </w:rPr>
-      </w:pPr>
-    </w:p>
-    <w:p/>
+          <w:color w:val="000000" w:themeColor="text1"/>
+          <w:sz w:val="20"/>
+          <w:szCs w:val="20"/>
+        </w:rPr>
+      </w:pPr>
+    </w:p>
+    <w:p>
+      <w:pPr>
+        <w:rPr>
+          <w:color w:val="000000" w:themeColor="text1"/>
+        </w:rPr>
+      </w:pPr>
+    </w:p>
     <w:p>
       <w:pPr>
         <w:ind w:left="-851"/>
         <w:rPr>
           <w:rFonts w:ascii="Arial" w:hAnsi="Arial" w:cs="Arial"/>
+          <w:color w:val="000000" w:themeColor="text1"/>
           <w:sz w:val="20"/>
           <w:szCs w:val="20"/>
         </w:rPr>
@@ -2932,6 +2791,7 @@
       <w:r>
         <w:rPr>
           <w:rFonts w:ascii="Arial" w:hAnsi="Arial" w:cs="Arial"/>
+          <w:color w:val="000000" w:themeColor="text1"/>
           <w:sz w:val="20"/>
           <w:szCs w:val="20"/>
         </w:rPr>
@@ -3212,8 +3072,160 @@
       </w:pPr>
     </w:lvl>
   </w:abstractNum>
+  <w:abstractNum w:abstractNumId="1" w15:restartNumberingAfterBreak="0">
+    <w:nsid w:val="2B691ABE"/>
+    <w:multiLevelType w:val="multilevel"/>
+    <w:tmpl w:val="38B25D2C"/>
+    <w:lvl w:ilvl="0">
+      <w:start w:val="1"/>
+      <w:numFmt w:val="bullet"/>
+      <w:lvlText w:val=""/>
+      <w:lvlJc w:val="left"/>
+      <w:pPr>
+        <w:tabs>
+          <w:tab w:val="num" w:pos="720"/>
+        </w:tabs>
+        <w:ind w:left="720" w:hanging="360"/>
+      </w:pPr>
+      <w:rPr>
+        <w:rFonts w:ascii="Symbol" w:hAnsi="Symbol" w:hint="default"/>
+        <w:sz w:val="20"/>
+      </w:rPr>
+    </w:lvl>
+    <w:lvl w:ilvl="1" w:tentative="1">
+      <w:start w:val="1"/>
+      <w:numFmt w:val="bullet"/>
+      <w:lvlText w:val="o"/>
+      <w:lvlJc w:val="left"/>
+      <w:pPr>
+        <w:tabs>
+          <w:tab w:val="num" w:pos="1440"/>
+        </w:tabs>
+        <w:ind w:left="1440" w:hanging="360"/>
+      </w:pPr>
+      <w:rPr>
+        <w:rFonts w:ascii="Courier New" w:hAnsi="Courier New" w:hint="default"/>
+        <w:sz w:val="20"/>
+      </w:rPr>
+    </w:lvl>
+    <w:lvl w:ilvl="2" w:tentative="1">
+      <w:start w:val="1"/>
+      <w:numFmt w:val="bullet"/>
+      <w:lvlText w:val=""/>
+      <w:lvlJc w:val="left"/>
+      <w:pPr>
+        <w:tabs>
+          <w:tab w:val="num" w:pos="2160"/>
+        </w:tabs>
+        <w:ind w:left="2160" w:hanging="360"/>
+      </w:pPr>
+      <w:rPr>
+        <w:rFonts w:ascii="Wingdings" w:hAnsi="Wingdings" w:hint="default"/>
+        <w:sz w:val="20"/>
+      </w:rPr>
+    </w:lvl>
+    <w:lvl w:ilvl="3" w:tentative="1">
+      <w:start w:val="1"/>
+      <w:numFmt w:val="bullet"/>
+      <w:lvlText w:val=""/>
+      <w:lvlJc w:val="left"/>
+      <w:pPr>
+        <w:tabs>
+          <w:tab w:val="num" w:pos="2880"/>
+        </w:tabs>
+        <w:ind w:left="2880" w:hanging="360"/>
+      </w:pPr>
+      <w:rPr>
+        <w:rFonts w:ascii="Wingdings" w:hAnsi="Wingdings" w:hint="default"/>
+        <w:sz w:val="20"/>
+      </w:rPr>
+    </w:lvl>
+    <w:lvl w:ilvl="4" w:tentative="1">
+      <w:start w:val="1"/>
+      <w:numFmt w:val="bullet"/>
+      <w:lvlText w:val=""/>
+      <w:lvlJc w:val="left"/>
+      <w:pPr>
+        <w:tabs>
+          <w:tab w:val="num" w:pos="3600"/>
+        </w:tabs>
+        <w:ind w:left="3600" w:hanging="360"/>
+      </w:pPr>
+      <w:rPr>
+        <w:rFonts w:ascii="Wingdings" w:hAnsi="Wingdings" w:hint="default"/>
+        <w:sz w:val="20"/>
+      </w:rPr>
+    </w:lvl>
+    <w:lvl w:ilvl="5" w:tentative="1">
+      <w:start w:val="1"/>
+      <w:numFmt w:val="bullet"/>
+      <w:lvlText w:val=""/>
+      <w:lvlJc w:val="left"/>
+      <w:pPr>
+        <w:tabs>
+          <w:tab w:val="num" w:pos="4320"/>
+        </w:tabs>
+        <w:ind w:left="4320" w:hanging="360"/>
+      </w:pPr>
+      <w:rPr>
+        <w:rFonts w:ascii="Wingdings" w:hAnsi="Wingdings" w:hint="default"/>
+        <w:sz w:val="20"/>
+      </w:rPr>
+    </w:lvl>
+    <w:lvl w:ilvl="6" w:tentative="1">
+      <w:start w:val="1"/>
+      <w:numFmt w:val="bullet"/>
+      <w:lvlText w:val=""/>
+      <w:lvlJc w:val="left"/>
+      <w:pPr>
+        <w:tabs>
+          <w:tab w:val="num" w:pos="5040"/>
+        </w:tabs>
+        <w:ind w:left="5040" w:hanging="360"/>
+      </w:pPr>
+      <w:rPr>
+        <w:rFonts w:ascii="Wingdings" w:hAnsi="Wingdings" w:hint="default"/>
+        <w:sz w:val="20"/>
+      </w:rPr>
+    </w:lvl>
+    <w:lvl w:ilvl="7" w:tentative="1">
+      <w:start w:val="1"/>
+      <w:numFmt w:val="bullet"/>
+      <w:lvlText w:val=""/>
+      <w:lvlJc w:val="left"/>
+      <w:pPr>
+        <w:tabs>
+          <w:tab w:val="num" w:pos="5760"/>
+        </w:tabs>
+        <w:ind w:left="5760" w:hanging="360"/>
+      </w:pPr>
+      <w:rPr>
+        <w:rFonts w:ascii="Wingdings" w:hAnsi="Wingdings" w:hint="default"/>
+        <w:sz w:val="20"/>
+      </w:rPr>
+    </w:lvl>
+    <w:lvl w:ilvl="8" w:tentative="1">
+      <w:start w:val="1"/>
+      <w:numFmt w:val="bullet"/>
+      <w:lvlText w:val=""/>
+      <w:lvlJc w:val="left"/>
+      <w:pPr>
+        <w:tabs>
+          <w:tab w:val="num" w:pos="6480"/>
+        </w:tabs>
+        <w:ind w:left="6480" w:hanging="360"/>
+      </w:pPr>
+      <w:rPr>
+        <w:rFonts w:ascii="Wingdings" w:hAnsi="Wingdings" w:hint="default"/>
+        <w:sz w:val="20"/>
+      </w:rPr>
+    </w:lvl>
+  </w:abstractNum>
   <w:num w:numId="1" w16cid:durableId="1535267491">
     <w:abstractNumId w:val="0"/>
+  </w:num>
+  <w:num w:numId="2" w16cid:durableId="1967853813">
+    <w:abstractNumId w:val="1"/>
   </w:num>
 </w:numbering>
 </file>
@@ -4052,6 +4064,15 @@
 </file>
 
 <file path=customXml/item1.xml><?xml version="1.0" encoding="utf-8"?>
+<?mso-contentType ?>
+<FormTemplates xmlns="http://schemas.microsoft.com/sharepoint/v3/contenttype/forms">
+  <Display>DocumentLibraryForm</Display>
+  <Edit>DocumentLibraryForm</Edit>
+  <New>DocumentLibraryForm</New>
+</FormTemplates>
+</file>
+
+<file path=customXml/item2.xml><?xml version="1.0" encoding="utf-8"?>
 <ct:contentTypeSchema xmlns:ct="http://schemas.microsoft.com/office/2006/metadata/contentType" xmlns:ma="http://schemas.microsoft.com/office/2006/metadata/properties/metaAttributes" ct:_="" ma:_="" ma:contentTypeName="Documento" ma:contentTypeID="0x01010045364877AF745B4281652B53F43C594A" ma:contentTypeVersion="15" ma:contentTypeDescription="Crie um novo documento." ma:contentTypeScope="" ma:versionID="440a6fbbcbce65e3f8e2bed610644788">
   <xsd:schema xmlns:xsd="http://www.w3.org/2001/XMLSchema" xmlns:xs="http://www.w3.org/2001/XMLSchema" xmlns:p="http://schemas.microsoft.com/office/2006/metadata/properties" xmlns:ns2="1d2798d9-1030-4cc5-be7b-200f9e628651" xmlns:ns3="8ca2a57e-8138-4b57-956a-eb6e2c7049cc" targetNamespace="http://schemas.microsoft.com/office/2006/metadata/properties" ma:root="true" ma:fieldsID="3ff20d9b6411658b7762fa2c08d7e1af" ns2:_="" ns3:_="">
     <xsd:import namespace="1d2798d9-1030-4cc5-be7b-200f9e628651"/>
@@ -4286,7 +4307,7 @@
 </ct:contentTypeSchema>
 </file>
 
-<file path=customXml/item2.xml><?xml version="1.0" encoding="utf-8"?>
+<file path=customXml/item3.xml><?xml version="1.0" encoding="utf-8"?>
 <p:properties xmlns:p="http://schemas.microsoft.com/office/2006/metadata/properties" xmlns:xsi="http://www.w3.org/2001/XMLSchema-instance" xmlns:pc="http://schemas.microsoft.com/office/infopath/2007/PartnerControls">
   <documentManagement>
     <lcf76f155ced4ddcb4097134ff3c332f xmlns="8ca2a57e-8138-4b57-956a-eb6e2c7049cc">
@@ -4297,16 +4318,15 @@
 </p:properties>
 </file>
 
-<file path=customXml/item3.xml><?xml version="1.0" encoding="utf-8"?>
-<?mso-contentType ?>
-<FormTemplates xmlns="http://schemas.microsoft.com/sharepoint/v3/contenttype/forms">
-  <Display>DocumentLibraryForm</Display>
-  <Edit>DocumentLibraryForm</Edit>
-  <New>DocumentLibraryForm</New>
-</FormTemplates>
+<file path=customXml/itemProps1.xml><?xml version="1.0" encoding="utf-8"?>
+<ds:datastoreItem xmlns:ds="http://schemas.openxmlformats.org/officeDocument/2006/customXml" ds:itemID="{6C7D064E-B9B1-4DD1-96C1-B59BEDBDE508}">
+  <ds:schemaRefs>
+    <ds:schemaRef ds:uri="http://schemas.microsoft.com/sharepoint/v3/contenttype/forms"/>
+  </ds:schemaRefs>
+</ds:datastoreItem>
 </file>
 
-<file path=customXml/itemProps1.xml><?xml version="1.0" encoding="utf-8"?>
+<file path=customXml/itemProps2.xml><?xml version="1.0" encoding="utf-8"?>
 <ds:datastoreItem xmlns:ds="http://schemas.openxmlformats.org/officeDocument/2006/customXml" ds:itemID="{5C49EB71-DCC6-4AD6-B283-AD28F75E5568}">
   <ds:schemaRefs>
     <ds:schemaRef ds:uri="http://schemas.microsoft.com/office/2006/metadata/contentType"/>
@@ -4325,7 +4345,7 @@
 </ds:datastoreItem>
 </file>
 
-<file path=customXml/itemProps2.xml><?xml version="1.0" encoding="utf-8"?>
+<file path=customXml/itemProps3.xml><?xml version="1.0" encoding="utf-8"?>
 <ds:datastoreItem xmlns:ds="http://schemas.openxmlformats.org/officeDocument/2006/customXml" ds:itemID="{DEC3F211-A3ED-4D74-812F-955FD328EBB9}">
   <ds:schemaRefs>
     <ds:schemaRef ds:uri="http://schemas.microsoft.com/office/2006/metadata/properties"/>
@@ -4334,12 +4354,4 @@
     <ds:schemaRef ds:uri="1d2798d9-1030-4cc5-be7b-200f9e628651"/>
   </ds:schemaRefs>
 </ds:datastoreItem>
-</file>
-
-<file path=customXml/itemProps3.xml><?xml version="1.0" encoding="utf-8"?>
-<ds:datastoreItem xmlns:ds="http://schemas.openxmlformats.org/officeDocument/2006/customXml" ds:itemID="{6C7D064E-B9B1-4DD1-96C1-B59BEDBDE508}">
-  <ds:schemaRefs>
-    <ds:schemaRef ds:uri="http://schemas.microsoft.com/sharepoint/v3/contenttype/forms"/>
-  </ds:schemaRefs>
-</ds:datastoreItem>
 </file>
</xml_diff>